<commit_message>
Fix portable voice, memory, and runtime reliability
</commit_message>
<xml_diff>
--- a/docs/彩叶_Iroha_Agent_工程验收与交接手册.docx
+++ b/docs/彩叶_Iroha_Agent_工程验收与交接手册.docx
@@ -80,7 +80,7 @@
           <w:color w:val="203B55"/>
           <w:sz w:val="20"/>
         </w:rPr>
-        <w:t>2.1.0</w:t>
+        <w:t>2.1.1</w:t>
       </w:r>
     </w:p>
     <w:p>
@@ -149,7 +149,7 @@
           <w:color w:val="203B55"/>
           <w:sz w:val="20"/>
         </w:rPr>
-        <w:t>2026-07-16</w:t>
+        <w:t>2026-07-17</w:t>
       </w:r>
     </w:p>
     <w:p/>
@@ -392,7 +392,7 @@
                 <w:color w:val="203B55"/>
                 <w:sz w:val="18"/>
               </w:rPr>
-              <w:t>2.1.0</w:t>
+              <w:t>2.1.1</w:t>
             </w:r>
           </w:p>
         </w:tc>
@@ -504,7 +504,7 @@
                 <w:color w:val="203B55"/>
                 <w:sz w:val="18"/>
               </w:rPr>
-              <w:t>2026-07-16</w:t>
+              <w:t>2026-07-17</w:t>
             </w:r>
           </w:p>
         </w:tc>
@@ -1964,7 +1964,7 @@
           <w:color w:val="203B55"/>
           <w:sz w:val="22"/>
         </w:rPr>
-        <w:t xml:space="preserve">检查本机 </w:t>
+        <w:t xml:space="preserve">检查本机配置端口的 </w:t>
       </w:r>
       <w:r>
         <w:rPr>
@@ -1972,7 +1972,7 @@
           <w:color w:val="1F4D78"/>
           <w:sz w:val="21"/>
         </w:rPr>
-        <w:t>127.0.0.1:9880/docs</w:t>
+        <w:t>/openapi.json</w:t>
       </w:r>
       <w:r>
         <w:rPr>
@@ -1980,7 +1980,23 @@
           <w:color w:val="203B55"/>
           <w:sz w:val="22"/>
         </w:rPr>
-        <w:t xml:space="preserve"> 是否健康。</w:t>
+        <w:t xml:space="preserve"> 是否包含真实 </w:t>
+      </w:r>
+      <w:r>
+        <w:rPr>
+          <w:rFonts w:ascii="Consolas" w:hAnsi="Consolas" w:eastAsia="Microsoft YaHei UI"/>
+          <w:color w:val="1F4D78"/>
+          <w:sz w:val="21"/>
+        </w:rPr>
+        <w:t>/tts</w:t>
+      </w:r>
+      <w:r>
+        <w:rPr>
+          <w:rFonts w:ascii="Calibri" w:hAnsi="Calibri" w:eastAsia="Microsoft YaHei UI"/>
+          <w:color w:val="203B55"/>
+          <w:sz w:val="22"/>
+        </w:rPr>
+        <w:t xml:space="preserve"> 接口。</w:t>
       </w:r>
     </w:p>
     <w:p>
@@ -2006,7 +2022,7 @@
           <w:color w:val="203B55"/>
           <w:sz w:val="22"/>
         </w:rPr>
-        <w:t>未找到运行时且 FullVoice 存在时，调用随包 7-Zip 解压到托管目录。</w:t>
+        <w:t>校验 FullVoice 分卷连续性、归档可读性和磁盘空间；解压到独立临时目录。</w:t>
       </w:r>
     </w:p>
     <w:p>
@@ -2109,7 +2125,7 @@
           <w:color w:val="203B55"/>
           <w:sz w:val="22"/>
         </w:rPr>
-        <w:t xml:space="preserve">生成 </w:t>
+        <w:t xml:space="preserve">将有效 </w:t>
       </w:r>
       <w:r>
         <w:rPr>
@@ -2125,7 +2141,7 @@
           <w:color w:val="203B55"/>
           <w:sz w:val="22"/>
         </w:rPr>
-        <w:t>。</w:t>
+        <w:t xml:space="preserve"> 复制或生成到应用可写托管目录，原始运行时保持不变。</w:t>
       </w:r>
     </w:p>
     <w:p>
@@ -2138,7 +2154,36 @@
           <w:color w:val="203B55"/>
           <w:sz w:val="22"/>
         </w:rPr>
-        <w:t xml:space="preserve">启动 </w:t>
+        <w:t xml:space="preserve">新运行时完整校验后原子切换，写入 </w:t>
+      </w:r>
+      <w:r>
+        <w:rPr>
+          <w:rFonts w:ascii="Consolas" w:hAnsi="Consolas" w:eastAsia="Microsoft YaHei UI"/>
+          <w:color w:val="1F4D78"/>
+          <w:sz w:val="21"/>
+        </w:rPr>
+        <w:t>.deployment-ready</w:t>
+      </w:r>
+      <w:r>
+        <w:rPr>
+          <w:rFonts w:ascii="Calibri" w:hAnsi="Calibri" w:eastAsia="Microsoft YaHei UI"/>
+          <w:color w:val="203B55"/>
+          <w:sz w:val="22"/>
+        </w:rPr>
+        <w:t>；失败自动恢复旧运行时。</w:t>
+      </w:r>
+    </w:p>
+    <w:p>
+      <w:pPr>
+        <w:pStyle w:val="ListNumber"/>
+      </w:pPr>
+      <w:r>
+        <w:rPr>
+          <w:rFonts w:ascii="Calibri" w:hAnsi="Calibri" w:eastAsia="Microsoft YaHei UI"/>
+          <w:color w:val="203B55"/>
+          <w:sz w:val="22"/>
+        </w:rPr>
+        <w:t xml:space="preserve">通过 Python 引导脚本设置独立 Numba 缓存，启动 </w:t>
       </w:r>
       <w:r>
         <w:rPr>
@@ -2154,7 +2199,36 @@
           <w:color w:val="203B55"/>
           <w:sz w:val="22"/>
         </w:rPr>
-        <w:t>，轮询健康状态。</w:t>
+        <w:t xml:space="preserve"> 并按墙钟时间轮询健康状态。</w:t>
+      </w:r>
+    </w:p>
+    <w:p>
+      <w:pPr>
+        <w:pStyle w:val="ListNumber"/>
+      </w:pPr>
+      <w:r>
+        <w:rPr>
+          <w:rFonts w:ascii="Calibri" w:hAnsi="Calibri" w:eastAsia="Microsoft YaHei UI"/>
+          <w:color w:val="203B55"/>
+          <w:sz w:val="22"/>
+        </w:rPr>
+        <w:t xml:space="preserve">自动处理 </w:t>
+      </w:r>
+      <w:r>
+        <w:rPr>
+          <w:rFonts w:ascii="Consolas" w:hAnsi="Consolas" w:eastAsia="Microsoft YaHei UI"/>
+          <w:color w:val="1F4D78"/>
+          <w:sz w:val="21"/>
+        </w:rPr>
+        <w:t>9880-9899</w:t>
+      </w:r>
+      <w:r>
+        <w:rPr>
+          <w:rFonts w:ascii="Calibri" w:hAnsi="Calibri" w:eastAsia="Microsoft YaHei UI"/>
+          <w:color w:val="203B55"/>
+          <w:sz w:val="22"/>
+        </w:rPr>
+        <w:t xml:space="preserve"> 端口占用并保存实际端口。</w:t>
       </w:r>
     </w:p>
     <w:p>
@@ -2620,6 +2694,112 @@
       </w:r>
     </w:p>
     <w:p>
+      <w:r>
+        <w:rPr>
+          <w:rFonts w:ascii="Calibri" w:hAnsi="Calibri" w:eastAsia="Microsoft YaHei UI"/>
+          <w:color w:val="203B55"/>
+          <w:sz w:val="22"/>
+        </w:rPr>
+        <w:t xml:space="preserve">Python 子进程不得通过旧版 </w:t>
+      </w:r>
+      <w:r>
+        <w:rPr>
+          <w:rFonts w:ascii="Consolas" w:hAnsi="Consolas" w:eastAsia="Microsoft YaHei UI"/>
+          <w:color w:val="1F4D78"/>
+          <w:sz w:val="21"/>
+        </w:rPr>
+        <w:t>.NET ProcessStartInfo.EnvironmentVariables</w:t>
+      </w:r>
+      <w:r>
+        <w:rPr>
+          <w:rFonts w:ascii="Calibri" w:hAnsi="Calibri" w:eastAsia="Microsoft YaHei UI"/>
+          <w:color w:val="203B55"/>
+          <w:sz w:val="22"/>
+        </w:rPr>
+        <w:t xml:space="preserve"> 注入变量；部分 Windows 同时存在 </w:t>
+      </w:r>
+      <w:r>
+        <w:rPr>
+          <w:rFonts w:ascii="Consolas" w:hAnsi="Consolas" w:eastAsia="Microsoft YaHei UI"/>
+          <w:color w:val="1F4D78"/>
+          <w:sz w:val="21"/>
+        </w:rPr>
+        <w:t>Path</w:t>
+      </w:r>
+      <w:r>
+        <w:rPr>
+          <w:rFonts w:ascii="Calibri" w:hAnsi="Calibri" w:eastAsia="Microsoft YaHei UI"/>
+          <w:color w:val="203B55"/>
+          <w:sz w:val="22"/>
+        </w:rPr>
+        <w:t xml:space="preserve"> / </w:t>
+      </w:r>
+      <w:r>
+        <w:rPr>
+          <w:rFonts w:ascii="Consolas" w:hAnsi="Consolas" w:eastAsia="Microsoft YaHei UI"/>
+          <w:color w:val="1F4D78"/>
+          <w:sz w:val="21"/>
+        </w:rPr>
+        <w:t>PATH</w:t>
+      </w:r>
+      <w:r>
+        <w:rPr>
+          <w:rFonts w:ascii="Calibri" w:hAnsi="Calibri" w:eastAsia="Microsoft YaHei UI"/>
+          <w:color w:val="203B55"/>
+          <w:sz w:val="22"/>
+        </w:rPr>
+        <w:t xml:space="preserve"> 时会触发大小写冲突。当前使用 </w:t>
+      </w:r>
+      <w:r>
+        <w:rPr>
+          <w:rFonts w:ascii="Consolas" w:hAnsi="Consolas" w:eastAsia="Microsoft YaHei UI"/>
+          <w:color w:val="1F4D78"/>
+          <w:sz w:val="21"/>
+        </w:rPr>
+        <w:t>-X utf8 -u</w:t>
+      </w:r>
+      <w:r>
+        <w:rPr>
+          <w:rFonts w:ascii="Calibri" w:hAnsi="Calibri" w:eastAsia="Microsoft YaHei UI"/>
+          <w:color w:val="203B55"/>
+          <w:sz w:val="22"/>
+        </w:rPr>
+        <w:t xml:space="preserve"> 和托管 </w:t>
+      </w:r>
+      <w:r>
+        <w:rPr>
+          <w:rFonts w:ascii="Consolas" w:hAnsi="Consolas" w:eastAsia="Microsoft YaHei UI"/>
+          <w:color w:val="1F4D78"/>
+          <w:sz w:val="21"/>
+        </w:rPr>
+        <w:t>start_voice.py</w:t>
+      </w:r>
+      <w:r>
+        <w:rPr>
+          <w:rFonts w:ascii="Calibri" w:hAnsi="Calibri" w:eastAsia="Microsoft YaHei UI"/>
+          <w:color w:val="203B55"/>
+          <w:sz w:val="22"/>
+        </w:rPr>
+        <w:t xml:space="preserve"> 设置 </w:t>
+      </w:r>
+      <w:r>
+        <w:rPr>
+          <w:rFonts w:ascii="Consolas" w:hAnsi="Consolas" w:eastAsia="Microsoft YaHei UI"/>
+          <w:color w:val="1F4D78"/>
+          <w:sz w:val="21"/>
+        </w:rPr>
+        <w:t>NUMBA_CACHE_DIR</w:t>
+      </w:r>
+      <w:r>
+        <w:rPr>
+          <w:rFonts w:ascii="Calibri" w:hAnsi="Calibri" w:eastAsia="Microsoft YaHei UI"/>
+          <w:color w:val="203B55"/>
+          <w:sz w:val="22"/>
+        </w:rPr>
+        <w:t>，兼顾实时诊断与跨电脑兼容。</w:t>
+      </w:r>
+    </w:p>
+    <w:p>
       <w:pPr>
         <w:pStyle w:val="Heading1"/>
       </w:pPr>
@@ -2722,6 +2902,32 @@
           <w:sz w:val="22"/>
         </w:rPr>
         <w:t>没有可恢复的随包运行时归档时，不删除唯一的托管运行时，仅重建语音配置。</w:t>
+      </w:r>
+    </w:p>
+    <w:p>
+      <w:pPr>
+        <w:pStyle w:val="ListBullet"/>
+      </w:pPr>
+      <w:r>
+        <w:rPr>
+          <w:rFonts w:ascii="Calibri" w:hAnsi="Calibri" w:eastAsia="Microsoft YaHei UI"/>
+          <w:color w:val="203B55"/>
+          <w:sz w:val="22"/>
+        </w:rPr>
+        <w:t>新部署只在临时目录完成，验证前保留旧运行时；缺失分卷或中断后恢复最后可用版本。</w:t>
+      </w:r>
+    </w:p>
+    <w:p>
+      <w:pPr>
+        <w:pStyle w:val="ListBullet"/>
+      </w:pPr>
+      <w:r>
+        <w:rPr>
+          <w:rFonts w:ascii="Calibri" w:hAnsi="Calibri" w:eastAsia="Microsoft YaHei UI"/>
+          <w:color w:val="203B55"/>
+          <w:sz w:val="22"/>
+        </w:rPr>
+        <w:t>GPT-SoVITS 使用托管 YAML 副本和缓存目录，不要求外部运行时可写。</w:t>
       </w:r>
     </w:p>
     <w:p>
@@ -2957,11 +3163,35 @@
             </w:pPr>
             <w:r>
               <w:rPr>
+                <w:rFonts w:ascii="Calibri" w:hAnsi="Calibri" w:eastAsia="Microsoft YaHei UI"/>
+                <w:color w:val="203B55"/>
+                <w:sz w:val="18"/>
+              </w:rPr>
+              <w:t xml:space="preserve">新安装 </w:t>
+            </w:r>
+            <w:r>
+              <w:rPr>
                 <w:rFonts w:ascii="Consolas" w:hAnsi="Consolas" w:eastAsia="Microsoft YaHei UI"/>
                 <w:color w:val="1F4D78"/>
                 <w:sz w:val="17"/>
               </w:rPr>
-              <w:t>%APPDATA%\IrohaLocalAgent\settings.json</w:t>
+              <w:t>%LOCALAPPDATA%\IrohaLocalAgent\settings.json</w:t>
+            </w:r>
+            <w:r>
+              <w:rPr>
+                <w:rFonts w:ascii="Calibri" w:hAnsi="Calibri" w:eastAsia="Microsoft YaHei UI"/>
+                <w:color w:val="203B55"/>
+                <w:sz w:val="18"/>
+              </w:rPr>
+              <w:t xml:space="preserve">；旧安装沿用 </w:t>
+            </w:r>
+            <w:r>
+              <w:rPr>
+                <w:rFonts w:ascii="Consolas" w:hAnsi="Consolas" w:eastAsia="Microsoft YaHei UI"/>
+                <w:color w:val="1F4D78"/>
+                <w:sz w:val="17"/>
+              </w:rPr>
+              <w:t>%APPDATA%</w:t>
             </w:r>
           </w:p>
         </w:tc>
@@ -3037,11 +3267,19 @@
             </w:pPr>
             <w:r>
               <w:rPr>
+                <w:rFonts w:ascii="Calibri" w:hAnsi="Calibri" w:eastAsia="Microsoft YaHei UI"/>
+                <w:color w:val="203B55"/>
+                <w:sz w:val="18"/>
+              </w:rPr>
+              <w:t xml:space="preserve">与设置同目录的 </w:t>
+            </w:r>
+            <w:r>
+              <w:rPr>
                 <w:rFonts w:ascii="Consolas" w:hAnsi="Consolas" w:eastAsia="Microsoft YaHei UI"/>
                 <w:color w:val="1F4D78"/>
                 <w:sz w:val="17"/>
               </w:rPr>
-              <w:t>%APPDATA%\IrohaLocalAgent\memory.json</w:t>
+              <w:t>memory.json</w:t>
             </w:r>
           </w:p>
         </w:tc>
@@ -3066,7 +3304,7 @@
                 <w:color w:val="203B55"/>
                 <w:sz w:val="18"/>
               </w:rPr>
-              <w:t>用户偏好和本地记忆</w:t>
+              <w:t>用户偏好和本地记忆；原子保存、备份恢复</w:t>
             </w:r>
           </w:p>
         </w:tc>
@@ -3256,6 +3494,86 @@
                 <w:color w:val="203B55"/>
                 <w:sz w:val="18"/>
               </w:rPr>
+              <w:t>语音缓存</w:t>
+            </w:r>
+          </w:p>
+        </w:tc>
+        <w:tc>
+          <w:tcPr>
+            <w:tcW w:type="dxa" w:w="3800"/>
+            <w:tcMar>
+              <w:top w:w="80" w:type="dxa"/>
+              <w:start w:w="120" w:type="dxa"/>
+              <w:bottom w:w="80" w:type="dxa"/>
+              <w:end w:w="120" w:type="dxa"/>
+            </w:tcMar>
+            <w:vAlign w:val="center"/>
+          </w:tcPr>
+          <w:p>
+            <w:pPr>
+              <w:spacing w:before="0" w:after="0" w:line="276" w:lineRule="auto"/>
+            </w:pPr>
+            <w:r>
+              <w:rPr>
+                <w:rFonts w:ascii="Consolas" w:hAnsi="Consolas" w:eastAsia="Microsoft YaHei UI"/>
+                <w:color w:val="1F4D78"/>
+                <w:sz w:val="17"/>
+              </w:rPr>
+              <w:t>%LOCALAPPDATA%\IrohaLocalAgent\VoiceCache</w:t>
+            </w:r>
+          </w:p>
+        </w:tc>
+        <w:tc>
+          <w:tcPr>
+            <w:tcW w:type="dxa" w:w="4060"/>
+            <w:tcMar>
+              <w:top w:w="80" w:type="dxa"/>
+              <w:start w:w="120" w:type="dxa"/>
+              <w:bottom w:w="80" w:type="dxa"/>
+              <w:end w:w="120" w:type="dxa"/>
+            </w:tcMar>
+            <w:vAlign w:val="center"/>
+          </w:tcPr>
+          <w:p>
+            <w:pPr>
+              <w:spacing w:before="0" w:after="0" w:line="276" w:lineRule="auto"/>
+            </w:pPr>
+            <w:r>
+              <w:rPr>
+                <w:rFonts w:ascii="Calibri" w:hAnsi="Calibri" w:eastAsia="Microsoft YaHei UI"/>
+                <w:color w:val="203B55"/>
+                <w:sz w:val="18"/>
+              </w:rPr>
+              <w:t>Python 引导脚本与 Numba 缓存</w:t>
+            </w:r>
+          </w:p>
+        </w:tc>
+      </w:tr>
+      <w:tr>
+        <w:trPr>
+          <w:cantSplit/>
+        </w:trPr>
+        <w:tc>
+          <w:tcPr>
+            <w:tcW w:type="dxa" w:w="1500"/>
+            <w:tcMar>
+              <w:top w:w="80" w:type="dxa"/>
+              <w:start w:w="120" w:type="dxa"/>
+              <w:bottom w:w="80" w:type="dxa"/>
+              <w:end w:w="120" w:type="dxa"/>
+            </w:tcMar>
+            <w:vAlign w:val="center"/>
+          </w:tcPr>
+          <w:p>
+            <w:pPr>
+              <w:spacing w:before="0" w:after="0" w:line="276" w:lineRule="auto"/>
+            </w:pPr>
+            <w:r>
+              <w:rPr>
+                <w:rFonts w:ascii="Calibri" w:hAnsi="Calibri" w:eastAsia="Microsoft YaHei UI"/>
+                <w:color w:val="203B55"/>
+                <w:sz w:val="18"/>
+              </w:rPr>
               <w:t>临时语音</w:t>
             </w:r>
           </w:p>
@@ -3361,7 +3679,7 @@
                 <w:color w:val="1F4D78"/>
                 <w:sz w:val="17"/>
               </w:rPr>
-              <w:t>%APPDATA%\IrohaLocalAgent\crash.log</w:t>
+              <w:t>%LOCALAPPDATA%\IrohaLocalAgent\crash.log</w:t>
             </w:r>
           </w:p>
         </w:tc>
@@ -3386,7 +3704,7 @@
                 <w:color w:val="203B55"/>
                 <w:sz w:val="18"/>
               </w:rPr>
-              <w:t>仅在未处理异常时写入，不在主界面展示</w:t>
+              <w:t>仅在首个未处理异常时写入，不在主界面展示或上传</w:t>
             </w:r>
           </w:p>
         </w:tc>
@@ -3949,7 +4267,7 @@
                 <w:color w:val="203B55"/>
                 <w:sz w:val="18"/>
               </w:rPr>
-              <w:t>匹配规则版本，当前为 2</w:t>
+              <w:t>匹配规则版本，当前为 3</w:t>
             </w:r>
           </w:p>
         </w:tc>
@@ -4109,7 +4427,7 @@
           <w:color w:val="1F4D78"/>
           <w:sz w:val="16"/>
         </w:rPr>
-        <w:t>.\tools\build-windows-release.ps1 -Version 2.1.0</w:t>
+        <w:t>.\tools\build-windows-release.ps1 -Version 2.1.1</w:t>
       </w:r>
     </w:p>
     <w:p>
@@ -4136,7 +4454,7 @@
         </w:rPr>
         <w:t>.\tools\build-windows-release.ps1 `</w:t>
         <w:br/>
-        <w:t xml:space="preserve">  -Version 2.1.0 `</w:t>
+        <w:t xml:space="preserve">  -Version 2.1.1 `</w:t>
         <w:br/>
         <w:t xml:space="preserve">  -FullVoice `</w:t>
         <w:br/>
@@ -4152,7 +4470,23 @@
           <w:color w:val="203B55"/>
           <w:sz w:val="22"/>
         </w:rPr>
-        <w:t>发布脚本执行：构建、复制、敏感文件检查、Portable ZIP、FullVoice 1.9 GB 分卷、Release 说明和 SHA-256 清单。</w:t>
+        <w:t xml:space="preserve">发布脚本默认先执行统一回归，再完成构建、复制、敏感文件检查、Portable ZIP、FullVoice 1.9 GB 分卷、Release 说明和 SHA-256 清单。仅诊断时才允许显式使用 </w:t>
+      </w:r>
+      <w:r>
+        <w:rPr>
+          <w:rFonts w:ascii="Consolas" w:hAnsi="Consolas" w:eastAsia="Microsoft YaHei UI"/>
+          <w:color w:val="1F4D78"/>
+          <w:sz w:val="21"/>
+        </w:rPr>
+        <w:t>-SkipQa</w:t>
+      </w:r>
+      <w:r>
+        <w:rPr>
+          <w:rFonts w:ascii="Calibri" w:hAnsi="Calibri" w:eastAsia="Microsoft YaHei UI"/>
+          <w:color w:val="203B55"/>
+          <w:sz w:val="22"/>
+        </w:rPr>
+        <w:t>。</w:t>
       </w:r>
     </w:p>
     <w:p>
@@ -5033,6 +5367,111 @@
                 <w:sz w:val="18"/>
               </w:rPr>
               <w:t>v2.1 视觉资源保护 QA</w:t>
+            </w:r>
+          </w:p>
+        </w:tc>
+      </w:tr>
+      <w:tr>
+        <w:trPr>
+          <w:cantSplit/>
+        </w:trPr>
+        <w:tc>
+          <w:tcPr>
+            <w:tcW w:type="dxa" w:w="1100"/>
+            <w:tcMar>
+              <w:top w:w="80" w:type="dxa"/>
+              <w:start w:w="120" w:type="dxa"/>
+              <w:bottom w:w="80" w:type="dxa"/>
+              <w:end w:w="120" w:type="dxa"/>
+            </w:tcMar>
+            <w:vAlign w:val="center"/>
+          </w:tcPr>
+          <w:p>
+            <w:pPr>
+              <w:spacing w:before="0" w:after="0" w:line="276" w:lineRule="auto"/>
+            </w:pPr>
+            <w:r>
+              <w:rPr>
+                <w:rFonts w:ascii="Calibri" w:hAnsi="Calibri" w:eastAsia="Microsoft YaHei UI"/>
+                <w:color w:val="203B55"/>
+                <w:sz w:val="18"/>
+              </w:rPr>
+              <w:t>W-08</w:t>
+            </w:r>
+          </w:p>
+        </w:tc>
+        <w:tc>
+          <w:tcPr>
+            <w:tcW w:type="dxa" w:w="2500"/>
+            <w:tcMar>
+              <w:top w:w="80" w:type="dxa"/>
+              <w:start w:w="120" w:type="dxa"/>
+              <w:bottom w:w="80" w:type="dxa"/>
+              <w:end w:w="120" w:type="dxa"/>
+            </w:tcMar>
+            <w:vAlign w:val="center"/>
+          </w:tcPr>
+          <w:p>
+            <w:pPr>
+              <w:spacing w:before="0" w:after="0" w:line="276" w:lineRule="auto"/>
+            </w:pPr>
+            <w:r>
+              <w:rPr>
+                <w:rFonts w:ascii="Calibri" w:hAnsi="Calibri" w:eastAsia="Microsoft YaHei UI"/>
+                <w:color w:val="203B55"/>
+                <w:sz w:val="18"/>
+              </w:rPr>
+              <w:t>会话菜单关闭期间保持存活并在消息处理后释放</w:t>
+            </w:r>
+          </w:p>
+        </w:tc>
+        <w:tc>
+          <w:tcPr>
+            <w:tcW w:type="dxa" w:w="1400"/>
+            <w:tcMar>
+              <w:top w:w="80" w:type="dxa"/>
+              <w:start w:w="120" w:type="dxa"/>
+              <w:bottom w:w="80" w:type="dxa"/>
+              <w:end w:w="120" w:type="dxa"/>
+            </w:tcMar>
+            <w:vAlign w:val="center"/>
+          </w:tcPr>
+          <w:p>
+            <w:pPr>
+              <w:spacing w:before="0" w:after="0" w:line="276" w:lineRule="auto"/>
+            </w:pPr>
+            <w:r>
+              <w:rPr>
+                <w:rFonts w:ascii="Calibri" w:hAnsi="Calibri" w:eastAsia="Microsoft YaHei UI"/>
+                <w:color w:val="203B55"/>
+                <w:sz w:val="18"/>
+              </w:rPr>
+              <w:t>通过</w:t>
+            </w:r>
+          </w:p>
+        </w:tc>
+        <w:tc>
+          <w:tcPr>
+            <w:tcW w:type="dxa" w:w="4360"/>
+            <w:tcMar>
+              <w:top w:w="80" w:type="dxa"/>
+              <w:start w:w="120" w:type="dxa"/>
+              <w:bottom w:w="80" w:type="dxa"/>
+              <w:end w:w="120" w:type="dxa"/>
+            </w:tcMar>
+            <w:vAlign w:val="center"/>
+          </w:tcPr>
+          <w:p>
+            <w:pPr>
+              <w:spacing w:before="0" w:after="0" w:line="276" w:lineRule="auto"/>
+            </w:pPr>
+            <w:r>
+              <w:rPr>
+                <w:rFonts w:ascii="Calibri" w:hAnsi="Calibri" w:eastAsia="Microsoft YaHei UI"/>
+                <w:color w:val="203B55"/>
+                <w:sz w:val="18"/>
+              </w:rPr>
+              <w:t>v2.1.1 功能 QA</w:t>
             </w:r>
           </w:p>
         </w:tc>
@@ -6112,6 +6551,531 @@
                 <w:color w:val="203B55"/>
                 <w:sz w:val="18"/>
               </w:rPr>
+              <w:t>B-07</w:t>
+            </w:r>
+          </w:p>
+        </w:tc>
+        <w:tc>
+          <w:tcPr>
+            <w:tcW w:type="dxa" w:w="2500"/>
+            <w:tcMar>
+              <w:top w:w="80" w:type="dxa"/>
+              <w:start w:w="120" w:type="dxa"/>
+              <w:bottom w:w="80" w:type="dxa"/>
+              <w:end w:w="120" w:type="dxa"/>
+            </w:tcMar>
+            <w:vAlign w:val="center"/>
+          </w:tcPr>
+          <w:p>
+            <w:pPr>
+              <w:spacing w:before="0" w:after="0" w:line="276" w:lineRule="auto"/>
+            </w:pPr>
+            <w:r>
+              <w:rPr>
+                <w:rFonts w:ascii="Calibri" w:hAnsi="Calibri" w:eastAsia="Microsoft YaHei UI"/>
+                <w:color w:val="203B55"/>
+                <w:sz w:val="18"/>
+              </w:rPr>
+              <w:t>分卷缺失时保留最后可用运行时并指出具体分卷</w:t>
+            </w:r>
+          </w:p>
+        </w:tc>
+        <w:tc>
+          <w:tcPr>
+            <w:tcW w:type="dxa" w:w="1400"/>
+            <w:tcMar>
+              <w:top w:w="80" w:type="dxa"/>
+              <w:start w:w="120" w:type="dxa"/>
+              <w:bottom w:w="80" w:type="dxa"/>
+              <w:end w:w="120" w:type="dxa"/>
+            </w:tcMar>
+            <w:vAlign w:val="center"/>
+          </w:tcPr>
+          <w:p>
+            <w:pPr>
+              <w:spacing w:before="0" w:after="0" w:line="276" w:lineRule="auto"/>
+            </w:pPr>
+            <w:r>
+              <w:rPr>
+                <w:rFonts w:ascii="Calibri" w:hAnsi="Calibri" w:eastAsia="Microsoft YaHei UI"/>
+                <w:color w:val="203B55"/>
+                <w:sz w:val="18"/>
+              </w:rPr>
+              <w:t>通过</w:t>
+            </w:r>
+          </w:p>
+        </w:tc>
+        <w:tc>
+          <w:tcPr>
+            <w:tcW w:type="dxa" w:w="4360"/>
+            <w:tcMar>
+              <w:top w:w="80" w:type="dxa"/>
+              <w:start w:w="120" w:type="dxa"/>
+              <w:bottom w:w="80" w:type="dxa"/>
+              <w:end w:w="120" w:type="dxa"/>
+            </w:tcMar>
+            <w:vAlign w:val="center"/>
+          </w:tcPr>
+          <w:p>
+            <w:pPr>
+              <w:spacing w:before="0" w:after="0" w:line="276" w:lineRule="auto"/>
+            </w:pPr>
+            <w:r>
+              <w:rPr>
+                <w:rFonts w:ascii="Calibri" w:hAnsi="Calibri" w:eastAsia="Microsoft YaHei UI"/>
+                <w:color w:val="203B55"/>
+                <w:sz w:val="18"/>
+              </w:rPr>
+              <w:t>v2.1.1 Bootstrap QA</w:t>
+            </w:r>
+          </w:p>
+        </w:tc>
+      </w:tr>
+      <w:tr>
+        <w:trPr>
+          <w:cantSplit/>
+        </w:trPr>
+        <w:tc>
+          <w:tcPr>
+            <w:tcW w:type="dxa" w:w="1100"/>
+            <w:tcMar>
+              <w:top w:w="80" w:type="dxa"/>
+              <w:start w:w="120" w:type="dxa"/>
+              <w:bottom w:w="80" w:type="dxa"/>
+              <w:end w:w="120" w:type="dxa"/>
+            </w:tcMar>
+            <w:vAlign w:val="center"/>
+          </w:tcPr>
+          <w:p>
+            <w:pPr>
+              <w:spacing w:before="0" w:after="0" w:line="276" w:lineRule="auto"/>
+            </w:pPr>
+            <w:r>
+              <w:rPr>
+                <w:rFonts w:ascii="Calibri" w:hAnsi="Calibri" w:eastAsia="Microsoft YaHei UI"/>
+                <w:color w:val="203B55"/>
+                <w:sz w:val="18"/>
+              </w:rPr>
+              <w:t>B-08</w:t>
+            </w:r>
+          </w:p>
+        </w:tc>
+        <w:tc>
+          <w:tcPr>
+            <w:tcW w:type="dxa" w:w="2500"/>
+            <w:tcMar>
+              <w:top w:w="80" w:type="dxa"/>
+              <w:start w:w="120" w:type="dxa"/>
+              <w:bottom w:w="80" w:type="dxa"/>
+              <w:end w:w="120" w:type="dxa"/>
+            </w:tcMar>
+            <w:vAlign w:val="center"/>
+          </w:tcPr>
+          <w:p>
+            <w:pPr>
+              <w:spacing w:before="0" w:after="0" w:line="276" w:lineRule="auto"/>
+            </w:pPr>
+            <w:r>
+              <w:rPr>
+                <w:rFonts w:ascii="Calibri" w:hAnsi="Calibri" w:eastAsia="Microsoft YaHei UI"/>
+                <w:color w:val="203B55"/>
+                <w:sz w:val="18"/>
+              </w:rPr>
+              <w:t>只读运行时 YAML 复制到托管目录且源哈希不变</w:t>
+            </w:r>
+          </w:p>
+        </w:tc>
+        <w:tc>
+          <w:tcPr>
+            <w:tcW w:type="dxa" w:w="1400"/>
+            <w:tcMar>
+              <w:top w:w="80" w:type="dxa"/>
+              <w:start w:w="120" w:type="dxa"/>
+              <w:bottom w:w="80" w:type="dxa"/>
+              <w:end w:w="120" w:type="dxa"/>
+            </w:tcMar>
+            <w:vAlign w:val="center"/>
+          </w:tcPr>
+          <w:p>
+            <w:pPr>
+              <w:spacing w:before="0" w:after="0" w:line="276" w:lineRule="auto"/>
+            </w:pPr>
+            <w:r>
+              <w:rPr>
+                <w:rFonts w:ascii="Calibri" w:hAnsi="Calibri" w:eastAsia="Microsoft YaHei UI"/>
+                <w:color w:val="203B55"/>
+                <w:sz w:val="18"/>
+              </w:rPr>
+              <w:t>通过</w:t>
+            </w:r>
+          </w:p>
+        </w:tc>
+        <w:tc>
+          <w:tcPr>
+            <w:tcW w:type="dxa" w:w="4360"/>
+            <w:tcMar>
+              <w:top w:w="80" w:type="dxa"/>
+              <w:start w:w="120" w:type="dxa"/>
+              <w:bottom w:w="80" w:type="dxa"/>
+              <w:end w:w="120" w:type="dxa"/>
+            </w:tcMar>
+            <w:vAlign w:val="center"/>
+          </w:tcPr>
+          <w:p>
+            <w:pPr>
+              <w:spacing w:before="0" w:after="0" w:line="276" w:lineRule="auto"/>
+            </w:pPr>
+            <w:r>
+              <w:rPr>
+                <w:rFonts w:ascii="Calibri" w:hAnsi="Calibri" w:eastAsia="Microsoft YaHei UI"/>
+                <w:color w:val="203B55"/>
+                <w:sz w:val="18"/>
+              </w:rPr>
+              <w:t>v2.1.1 Bootstrap QA</w:t>
+            </w:r>
+          </w:p>
+        </w:tc>
+      </w:tr>
+      <w:tr>
+        <w:trPr>
+          <w:cantSplit/>
+        </w:trPr>
+        <w:tc>
+          <w:tcPr>
+            <w:tcW w:type="dxa" w:w="1100"/>
+            <w:tcMar>
+              <w:top w:w="80" w:type="dxa"/>
+              <w:start w:w="120" w:type="dxa"/>
+              <w:bottom w:w="80" w:type="dxa"/>
+              <w:end w:w="120" w:type="dxa"/>
+            </w:tcMar>
+            <w:vAlign w:val="center"/>
+          </w:tcPr>
+          <w:p>
+            <w:pPr>
+              <w:spacing w:before="0" w:after="0" w:line="276" w:lineRule="auto"/>
+            </w:pPr>
+            <w:r>
+              <w:rPr>
+                <w:rFonts w:ascii="Calibri" w:hAnsi="Calibri" w:eastAsia="Microsoft YaHei UI"/>
+                <w:color w:val="203B55"/>
+                <w:sz w:val="18"/>
+              </w:rPr>
+              <w:t>B-09</w:t>
+            </w:r>
+          </w:p>
+        </w:tc>
+        <w:tc>
+          <w:tcPr>
+            <w:tcW w:type="dxa" w:w="2500"/>
+            <w:tcMar>
+              <w:top w:w="80" w:type="dxa"/>
+              <w:start w:w="120" w:type="dxa"/>
+              <w:bottom w:w="80" w:type="dxa"/>
+              <w:end w:w="120" w:type="dxa"/>
+            </w:tcMar>
+            <w:vAlign w:val="center"/>
+          </w:tcPr>
+          <w:p>
+            <w:pPr>
+              <w:spacing w:before="0" w:after="0" w:line="276" w:lineRule="auto"/>
+            </w:pPr>
+            <w:r>
+              <w:rPr>
+                <w:rFonts w:ascii="Calibri" w:hAnsi="Calibri" w:eastAsia="Microsoft YaHei UI"/>
+                <w:color w:val="203B55"/>
+                <w:sz w:val="18"/>
+              </w:rPr>
+              <w:t>跨 Windows 用户路径自动重新匹配</w:t>
+            </w:r>
+          </w:p>
+        </w:tc>
+        <w:tc>
+          <w:tcPr>
+            <w:tcW w:type="dxa" w:w="1400"/>
+            <w:tcMar>
+              <w:top w:w="80" w:type="dxa"/>
+              <w:start w:w="120" w:type="dxa"/>
+              <w:bottom w:w="80" w:type="dxa"/>
+              <w:end w:w="120" w:type="dxa"/>
+            </w:tcMar>
+            <w:vAlign w:val="center"/>
+          </w:tcPr>
+          <w:p>
+            <w:pPr>
+              <w:spacing w:before="0" w:after="0" w:line="276" w:lineRule="auto"/>
+            </w:pPr>
+            <w:r>
+              <w:rPr>
+                <w:rFonts w:ascii="Calibri" w:hAnsi="Calibri" w:eastAsia="Microsoft YaHei UI"/>
+                <w:color w:val="203B55"/>
+                <w:sz w:val="18"/>
+              </w:rPr>
+              <w:t>通过</w:t>
+            </w:r>
+          </w:p>
+        </w:tc>
+        <w:tc>
+          <w:tcPr>
+            <w:tcW w:type="dxa" w:w="4360"/>
+            <w:tcMar>
+              <w:top w:w="80" w:type="dxa"/>
+              <w:start w:w="120" w:type="dxa"/>
+              <w:bottom w:w="80" w:type="dxa"/>
+              <w:end w:w="120" w:type="dxa"/>
+            </w:tcMar>
+            <w:vAlign w:val="center"/>
+          </w:tcPr>
+          <w:p>
+            <w:pPr>
+              <w:spacing w:before="0" w:after="0" w:line="276" w:lineRule="auto"/>
+            </w:pPr>
+            <w:r>
+              <w:rPr>
+                <w:rFonts w:ascii="Calibri" w:hAnsi="Calibri" w:eastAsia="Microsoft YaHei UI"/>
+                <w:color w:val="203B55"/>
+                <w:sz w:val="18"/>
+              </w:rPr>
+              <w:t>v2.1.1 Bootstrap QA</w:t>
+            </w:r>
+          </w:p>
+        </w:tc>
+      </w:tr>
+      <w:tr>
+        <w:trPr>
+          <w:cantSplit/>
+        </w:trPr>
+        <w:tc>
+          <w:tcPr>
+            <w:tcW w:type="dxa" w:w="1100"/>
+            <w:tcMar>
+              <w:top w:w="80" w:type="dxa"/>
+              <w:start w:w="120" w:type="dxa"/>
+              <w:bottom w:w="80" w:type="dxa"/>
+              <w:end w:w="120" w:type="dxa"/>
+            </w:tcMar>
+            <w:vAlign w:val="center"/>
+          </w:tcPr>
+          <w:p>
+            <w:pPr>
+              <w:spacing w:before="0" w:after="0" w:line="276" w:lineRule="auto"/>
+            </w:pPr>
+            <w:r>
+              <w:rPr>
+                <w:rFonts w:ascii="Calibri" w:hAnsi="Calibri" w:eastAsia="Microsoft YaHei UI"/>
+                <w:color w:val="203B55"/>
+                <w:sz w:val="18"/>
+              </w:rPr>
+              <w:t>M-01</w:t>
+            </w:r>
+          </w:p>
+        </w:tc>
+        <w:tc>
+          <w:tcPr>
+            <w:tcW w:type="dxa" w:w="2500"/>
+            <w:tcMar>
+              <w:top w:w="80" w:type="dxa"/>
+              <w:start w:w="120" w:type="dxa"/>
+              <w:bottom w:w="80" w:type="dxa"/>
+              <w:end w:w="120" w:type="dxa"/>
+            </w:tcMar>
+            <w:vAlign w:val="center"/>
+          </w:tcPr>
+          <w:p>
+            <w:pPr>
+              <w:spacing w:before="0" w:after="0" w:line="276" w:lineRule="auto"/>
+            </w:pPr>
+            <w:r>
+              <w:rPr>
+                <w:rFonts w:ascii="Calibri" w:hAnsi="Calibri" w:eastAsia="Microsoft YaHei UI"/>
+                <w:color w:val="203B55"/>
+                <w:sz w:val="18"/>
+              </w:rPr>
+              <w:t>记忆原子保存、并发写入与损坏恢复</w:t>
+            </w:r>
+          </w:p>
+        </w:tc>
+        <w:tc>
+          <w:tcPr>
+            <w:tcW w:type="dxa" w:w="1400"/>
+            <w:tcMar>
+              <w:top w:w="80" w:type="dxa"/>
+              <w:start w:w="120" w:type="dxa"/>
+              <w:bottom w:w="80" w:type="dxa"/>
+              <w:end w:w="120" w:type="dxa"/>
+            </w:tcMar>
+            <w:vAlign w:val="center"/>
+          </w:tcPr>
+          <w:p>
+            <w:pPr>
+              <w:spacing w:before="0" w:after="0" w:line="276" w:lineRule="auto"/>
+            </w:pPr>
+            <w:r>
+              <w:rPr>
+                <w:rFonts w:ascii="Calibri" w:hAnsi="Calibri" w:eastAsia="Microsoft YaHei UI"/>
+                <w:color w:val="203B55"/>
+                <w:sz w:val="18"/>
+              </w:rPr>
+              <w:t>通过</w:t>
+            </w:r>
+          </w:p>
+        </w:tc>
+        <w:tc>
+          <w:tcPr>
+            <w:tcW w:type="dxa" w:w="4360"/>
+            <w:tcMar>
+              <w:top w:w="80" w:type="dxa"/>
+              <w:start w:w="120" w:type="dxa"/>
+              <w:bottom w:w="80" w:type="dxa"/>
+              <w:end w:w="120" w:type="dxa"/>
+            </w:tcMar>
+            <w:vAlign w:val="center"/>
+          </w:tcPr>
+          <w:p>
+            <w:pPr>
+              <w:spacing w:before="0" w:after="0" w:line="276" w:lineRule="auto"/>
+            </w:pPr>
+            <w:r>
+              <w:rPr>
+                <w:rFonts w:ascii="Calibri" w:hAnsi="Calibri" w:eastAsia="Microsoft YaHei UI"/>
+                <w:color w:val="203B55"/>
+                <w:sz w:val="18"/>
+              </w:rPr>
+              <w:t>v2.1.1 Memory QA</w:t>
+            </w:r>
+          </w:p>
+        </w:tc>
+      </w:tr>
+      <w:tr>
+        <w:trPr>
+          <w:cantSplit/>
+        </w:trPr>
+        <w:tc>
+          <w:tcPr>
+            <w:tcW w:type="dxa" w:w="1100"/>
+            <w:tcMar>
+              <w:top w:w="80" w:type="dxa"/>
+              <w:start w:w="120" w:type="dxa"/>
+              <w:bottom w:w="80" w:type="dxa"/>
+              <w:end w:w="120" w:type="dxa"/>
+            </w:tcMar>
+            <w:vAlign w:val="center"/>
+          </w:tcPr>
+          <w:p>
+            <w:pPr>
+              <w:spacing w:before="0" w:after="0" w:line="276" w:lineRule="auto"/>
+            </w:pPr>
+            <w:r>
+              <w:rPr>
+                <w:rFonts w:ascii="Calibri" w:hAnsi="Calibri" w:eastAsia="Microsoft YaHei UI"/>
+                <w:color w:val="203B55"/>
+                <w:sz w:val="18"/>
+              </w:rPr>
+              <w:t>M-02</w:t>
+            </w:r>
+          </w:p>
+        </w:tc>
+        <w:tc>
+          <w:tcPr>
+            <w:tcW w:type="dxa" w:w="2500"/>
+            <w:tcMar>
+              <w:top w:w="80" w:type="dxa"/>
+              <w:start w:w="120" w:type="dxa"/>
+              <w:bottom w:w="80" w:type="dxa"/>
+              <w:end w:w="120" w:type="dxa"/>
+            </w:tcMar>
+            <w:vAlign w:val="center"/>
+          </w:tcPr>
+          <w:p>
+            <w:pPr>
+              <w:spacing w:before="0" w:after="0" w:line="276" w:lineRule="auto"/>
+            </w:pPr>
+            <w:r>
+              <w:rPr>
+                <w:rFonts w:ascii="Calibri" w:hAnsi="Calibri" w:eastAsia="Microsoft YaHei UI"/>
+                <w:color w:val="203B55"/>
+                <w:sz w:val="18"/>
+              </w:rPr>
+              <w:t>一次性任务和 API 密钥不进入长期记忆</w:t>
+            </w:r>
+          </w:p>
+        </w:tc>
+        <w:tc>
+          <w:tcPr>
+            <w:tcW w:type="dxa" w:w="1400"/>
+            <w:tcMar>
+              <w:top w:w="80" w:type="dxa"/>
+              <w:start w:w="120" w:type="dxa"/>
+              <w:bottom w:w="80" w:type="dxa"/>
+              <w:end w:w="120" w:type="dxa"/>
+            </w:tcMar>
+            <w:vAlign w:val="center"/>
+          </w:tcPr>
+          <w:p>
+            <w:pPr>
+              <w:spacing w:before="0" w:after="0" w:line="276" w:lineRule="auto"/>
+            </w:pPr>
+            <w:r>
+              <w:rPr>
+                <w:rFonts w:ascii="Calibri" w:hAnsi="Calibri" w:eastAsia="Microsoft YaHei UI"/>
+                <w:color w:val="203B55"/>
+                <w:sz w:val="18"/>
+              </w:rPr>
+              <w:t>通过</w:t>
+            </w:r>
+          </w:p>
+        </w:tc>
+        <w:tc>
+          <w:tcPr>
+            <w:tcW w:type="dxa" w:w="4360"/>
+            <w:tcMar>
+              <w:top w:w="80" w:type="dxa"/>
+              <w:start w:w="120" w:type="dxa"/>
+              <w:bottom w:w="80" w:type="dxa"/>
+              <w:end w:w="120" w:type="dxa"/>
+            </w:tcMar>
+            <w:vAlign w:val="center"/>
+          </w:tcPr>
+          <w:p>
+            <w:pPr>
+              <w:spacing w:before="0" w:after="0" w:line="276" w:lineRule="auto"/>
+            </w:pPr>
+            <w:r>
+              <w:rPr>
+                <w:rFonts w:ascii="Calibri" w:hAnsi="Calibri" w:eastAsia="Microsoft YaHei UI"/>
+                <w:color w:val="203B55"/>
+                <w:sz w:val="18"/>
+              </w:rPr>
+              <w:t>v2.1.1 Memory QA</w:t>
+            </w:r>
+          </w:p>
+        </w:tc>
+      </w:tr>
+      <w:tr>
+        <w:trPr>
+          <w:cantSplit/>
+        </w:trPr>
+        <w:tc>
+          <w:tcPr>
+            <w:tcW w:type="dxa" w:w="1100"/>
+            <w:tcMar>
+              <w:top w:w="80" w:type="dxa"/>
+              <w:start w:w="120" w:type="dxa"/>
+              <w:bottom w:w="80" w:type="dxa"/>
+              <w:end w:w="120" w:type="dxa"/>
+            </w:tcMar>
+            <w:vAlign w:val="center"/>
+          </w:tcPr>
+          <w:p>
+            <w:pPr>
+              <w:spacing w:before="0" w:after="0" w:line="276" w:lineRule="auto"/>
+            </w:pPr>
+            <w:r>
+              <w:rPr>
+                <w:rFonts w:ascii="Calibri" w:hAnsi="Calibri" w:eastAsia="Microsoft YaHei UI"/>
+                <w:color w:val="203B55"/>
+                <w:sz w:val="18"/>
+              </w:rPr>
               <w:t>P-01</w:t>
             </w:r>
           </w:p>
@@ -6342,6 +7306,14 @@
         <w:t>docs/evidence/round-2026-07-16-v21-settings.png</w:t>
         <w:br/>
         <w:t>docs/evidence/round-2026-07-16-v21-standard.png</w:t>
+        <w:br/>
+        <w:t>docs/evidence/round-2026-07-17-v211-functional-qa.txt</w:t>
+        <w:br/>
+        <w:t>docs/evidence/round-2026-07-17-v211-bootstrap-qa.txt</w:t>
+        <w:br/>
+        <w:t>docs/evidence/round-2026-07-17-v211-memory-qa.txt</w:t>
+        <w:br/>
+        <w:t>docs/evidence/round-2026-07-17-v211-full-voice-qa.txt</w:t>
       </w:r>
     </w:p>
     <w:p>
@@ -6792,7 +7764,7 @@
                 <w:color w:val="203B55"/>
                 <w:sz w:val="18"/>
               </w:rPr>
-              <w:t>9880 端口、CPU 占用、杀毒软件</w:t>
+              <w:t>CPU 占用、杀毒软件、Numba 缓存</w:t>
             </w:r>
           </w:p>
         </w:tc>
@@ -6817,7 +7789,7 @@
                 <w:color w:val="203B55"/>
                 <w:sz w:val="18"/>
               </w:rPr>
-              <w:t>等待模型加载；关闭占用端口的进程后重新部署</w:t>
+              <w:t>等待进度；应用最长 10 分钟后清理本次进程，可重新部署</w:t>
             </w:r>
           </w:p>
         </w:tc>
@@ -6843,11 +7815,36 @@
             </w:pPr>
             <w:r>
               <w:rPr>
+                <w:rFonts w:ascii="Calibri" w:hAnsi="Calibri" w:eastAsia="Microsoft YaHei UI"/>
+                <w:color w:val="203B55"/>
+                <w:sz w:val="18"/>
+              </w:rPr>
+              <w:t>端口被占用</w:t>
+            </w:r>
+          </w:p>
+        </w:tc>
+        <w:tc>
+          <w:tcPr>
+            <w:tcW w:type="dxa" w:w="3800"/>
+            <w:tcMar>
+              <w:top w:w="80" w:type="dxa"/>
+              <w:start w:w="120" w:type="dxa"/>
+              <w:bottom w:w="80" w:type="dxa"/>
+              <w:end w:w="120" w:type="dxa"/>
+            </w:tcMar>
+            <w:vAlign w:val="center"/>
+          </w:tcPr>
+          <w:p>
+            <w:pPr>
+              <w:spacing w:before="0" w:after="0" w:line="276" w:lineRule="auto"/>
+            </w:pPr>
+            <w:r>
+              <w:rPr>
                 <w:rFonts w:ascii="Consolas" w:hAnsi="Consolas" w:eastAsia="Microsoft YaHei UI"/>
                 <w:color w:val="1F4D78"/>
                 <w:sz w:val="17"/>
               </w:rPr>
-              <w:t>/docs</w:t>
+              <w:t>9880-9899</w:t>
             </w:r>
             <w:r>
               <w:rPr>
@@ -6855,7 +7852,62 @@
                 <w:color w:val="203B55"/>
                 <w:sz w:val="18"/>
               </w:rPr>
-              <w:t xml:space="preserve"> 可访问但无音频</w:t>
+              <w:t xml:space="preserve"> 是否有其他服务</w:t>
+            </w:r>
+          </w:p>
+        </w:tc>
+        <w:tc>
+          <w:tcPr>
+            <w:tcW w:type="dxa" w:w="4060"/>
+            <w:tcMar>
+              <w:top w:w="80" w:type="dxa"/>
+              <w:start w:w="120" w:type="dxa"/>
+              <w:bottom w:w="80" w:type="dxa"/>
+              <w:end w:w="120" w:type="dxa"/>
+            </w:tcMar>
+            <w:vAlign w:val="center"/>
+          </w:tcPr>
+          <w:p>
+            <w:pPr>
+              <w:spacing w:before="0" w:after="0" w:line="276" w:lineRule="auto"/>
+            </w:pPr>
+            <w:r>
+              <w:rPr>
+                <w:rFonts w:ascii="Calibri" w:hAnsi="Calibri" w:eastAsia="Microsoft YaHei UI"/>
+                <w:color w:val="203B55"/>
+                <w:sz w:val="18"/>
+              </w:rPr>
+              <w:t>应用自动选择可用端口并保存，不需要手工改端口</w:t>
+            </w:r>
+          </w:p>
+        </w:tc>
+      </w:tr>
+      <w:tr>
+        <w:trPr>
+          <w:cantSplit/>
+        </w:trPr>
+        <w:tc>
+          <w:tcPr>
+            <w:tcW w:type="dxa" w:w="1500"/>
+            <w:tcMar>
+              <w:top w:w="80" w:type="dxa"/>
+              <w:start w:w="120" w:type="dxa"/>
+              <w:bottom w:w="80" w:type="dxa"/>
+              <w:end w:w="120" w:type="dxa"/>
+            </w:tcMar>
+            <w:vAlign w:val="center"/>
+          </w:tcPr>
+          <w:p>
+            <w:pPr>
+              <w:spacing w:before="0" w:after="0" w:line="276" w:lineRule="auto"/>
+            </w:pPr>
+            <w:r>
+              <w:rPr>
+                <w:rFonts w:ascii="Calibri" w:hAnsi="Calibri" w:eastAsia="Microsoft YaHei UI"/>
+                <w:color w:val="203B55"/>
+                <w:sz w:val="18"/>
+              </w:rPr>
+              <w:t>OpenAPI 可访问但无音频</w:t>
             </w:r>
           </w:p>
         </w:tc>
@@ -6880,7 +7932,23 @@
                 <w:color w:val="203B55"/>
                 <w:sz w:val="18"/>
               </w:rPr>
-              <w:t>YAML 权重路径、参考音频、服务错误输出</w:t>
+              <w:t xml:space="preserve">是否存在真实 </w:t>
+            </w:r>
+            <w:r>
+              <w:rPr>
+                <w:rFonts w:ascii="Consolas" w:hAnsi="Consolas" w:eastAsia="Microsoft YaHei UI"/>
+                <w:color w:val="1F4D78"/>
+                <w:sz w:val="17"/>
+              </w:rPr>
+              <w:t>/tts</w:t>
+            </w:r>
+            <w:r>
+              <w:rPr>
+                <w:rFonts w:ascii="Calibri" w:hAnsi="Calibri" w:eastAsia="Microsoft YaHei UI"/>
+                <w:color w:val="203B55"/>
+                <w:sz w:val="18"/>
+              </w:rPr>
+              <w:t>、YAML 权重路径和参考音频</w:t>
             </w:r>
           </w:p>
         </w:tc>
@@ -6905,7 +7973,103 @@
                 <w:color w:val="203B55"/>
                 <w:sz w:val="18"/>
               </w:rPr>
-              <w:t>点击重新部署；必要时检查手动服务日志</w:t>
+              <w:t>点击重新部署；应用不会把无关本地服务误判为 GPT-SoVITS</w:t>
+            </w:r>
+          </w:p>
+        </w:tc>
+      </w:tr>
+      <w:tr>
+        <w:trPr>
+          <w:cantSplit/>
+        </w:trPr>
+        <w:tc>
+          <w:tcPr>
+            <w:tcW w:type="dxa" w:w="1500"/>
+            <w:tcMar>
+              <w:top w:w="80" w:type="dxa"/>
+              <w:start w:w="120" w:type="dxa"/>
+              <w:bottom w:w="80" w:type="dxa"/>
+              <w:end w:w="120" w:type="dxa"/>
+            </w:tcMar>
+            <w:vAlign w:val="center"/>
+          </w:tcPr>
+          <w:p>
+            <w:pPr>
+              <w:spacing w:before="0" w:after="0" w:line="276" w:lineRule="auto"/>
+            </w:pPr>
+            <w:r>
+              <w:rPr>
+                <w:rFonts w:ascii="Calibri" w:hAnsi="Calibri" w:eastAsia="Microsoft YaHei UI"/>
+                <w:color w:val="203B55"/>
+                <w:sz w:val="18"/>
+              </w:rPr>
+              <w:t>记忆突然为空</w:t>
+            </w:r>
+          </w:p>
+        </w:tc>
+        <w:tc>
+          <w:tcPr>
+            <w:tcW w:type="dxa" w:w="3800"/>
+            <w:tcMar>
+              <w:top w:w="80" w:type="dxa"/>
+              <w:start w:w="120" w:type="dxa"/>
+              <w:bottom w:w="80" w:type="dxa"/>
+              <w:end w:w="120" w:type="dxa"/>
+            </w:tcMar>
+            <w:vAlign w:val="center"/>
+          </w:tcPr>
+          <w:p>
+            <w:pPr>
+              <w:spacing w:before="0" w:after="0" w:line="276" w:lineRule="auto"/>
+            </w:pPr>
+            <w:r>
+              <w:rPr>
+                <w:rFonts w:ascii="Consolas" w:hAnsi="Consolas" w:eastAsia="Microsoft YaHei UI"/>
+                <w:color w:val="1F4D78"/>
+                <w:sz w:val="17"/>
+              </w:rPr>
+              <w:t>memory.json.bak</w:t>
+            </w:r>
+            <w:r>
+              <w:rPr>
+                <w:rFonts w:ascii="Calibri" w:hAnsi="Calibri" w:eastAsia="Microsoft YaHei UI"/>
+                <w:color w:val="203B55"/>
+                <w:sz w:val="18"/>
+              </w:rPr>
+              <w:t xml:space="preserve"> 与 </w:t>
+            </w:r>
+            <w:r>
+              <w:rPr>
+                <w:rFonts w:ascii="Consolas" w:hAnsi="Consolas" w:eastAsia="Microsoft YaHei UI"/>
+                <w:color w:val="1F4D78"/>
+                <w:sz w:val="17"/>
+              </w:rPr>
+              <w:t>.corrupt</w:t>
+            </w:r>
+          </w:p>
+        </w:tc>
+        <w:tc>
+          <w:tcPr>
+            <w:tcW w:type="dxa" w:w="4060"/>
+            <w:tcMar>
+              <w:top w:w="80" w:type="dxa"/>
+              <w:start w:w="120" w:type="dxa"/>
+              <w:bottom w:w="80" w:type="dxa"/>
+              <w:end w:w="120" w:type="dxa"/>
+            </w:tcMar>
+            <w:vAlign w:val="center"/>
+          </w:tcPr>
+          <w:p>
+            <w:pPr>
+              <w:spacing w:before="0" w:after="0" w:line="276" w:lineRule="auto"/>
+            </w:pPr>
+            <w:r>
+              <w:rPr>
+                <w:rFonts w:ascii="Calibri" w:hAnsi="Calibri" w:eastAsia="Microsoft YaHei UI"/>
+                <w:color w:val="203B55"/>
+                <w:sz w:val="18"/>
+              </w:rPr>
+              <w:t>应用会自动从备份恢复；保留损坏副本供人工核查</w:t>
             </w:r>
           </w:p>
         </w:tc>
@@ -7150,6 +8314,126 @@
           </w:p>
         </w:tc>
       </w:tr>
+      <w:tr>
+        <w:trPr>
+          <w:cantSplit/>
+        </w:trPr>
+        <w:tc>
+          <w:tcPr>
+            <w:tcW w:type="dxa" w:w="1500"/>
+            <w:tcMar>
+              <w:top w:w="80" w:type="dxa"/>
+              <w:start w:w="120" w:type="dxa"/>
+              <w:bottom w:w="80" w:type="dxa"/>
+              <w:end w:w="120" w:type="dxa"/>
+            </w:tcMar>
+            <w:vAlign w:val="center"/>
+          </w:tcPr>
+          <w:p>
+            <w:pPr>
+              <w:spacing w:before="0" w:after="0" w:line="276" w:lineRule="auto"/>
+            </w:pPr>
+            <w:r>
+              <w:rPr>
+                <w:rFonts w:ascii="Calibri" w:hAnsi="Calibri" w:eastAsia="Microsoft YaHei UI"/>
+                <w:color w:val="203B55"/>
+                <w:sz w:val="18"/>
+              </w:rPr>
+              <w:t>点击会话菜单后反复弹错</w:t>
+            </w:r>
+          </w:p>
+        </w:tc>
+        <w:tc>
+          <w:tcPr>
+            <w:tcW w:type="dxa" w:w="3800"/>
+            <w:tcMar>
+              <w:top w:w="80" w:type="dxa"/>
+              <w:start w:w="120" w:type="dxa"/>
+              <w:bottom w:w="80" w:type="dxa"/>
+              <w:end w:w="120" w:type="dxa"/>
+            </w:tcMar>
+            <w:vAlign w:val="center"/>
+          </w:tcPr>
+          <w:p>
+            <w:pPr>
+              <w:spacing w:before="0" w:after="0" w:line="276" w:lineRule="auto"/>
+            </w:pPr>
+            <w:r>
+              <w:rPr>
+                <w:rFonts w:ascii="Calibri" w:hAnsi="Calibri" w:eastAsia="Microsoft YaHei UI"/>
+                <w:color w:val="203B55"/>
+                <w:sz w:val="18"/>
+              </w:rPr>
+              <w:t xml:space="preserve">旧版 </w:t>
+            </w:r>
+            <w:r>
+              <w:rPr>
+                <w:rFonts w:ascii="Consolas" w:hAnsi="Consolas" w:eastAsia="Microsoft YaHei UI"/>
+                <w:color w:val="1F4D78"/>
+                <w:sz w:val="17"/>
+              </w:rPr>
+              <w:t>crash.log</w:t>
+            </w:r>
+            <w:r>
+              <w:rPr>
+                <w:rFonts w:ascii="Calibri" w:hAnsi="Calibri" w:eastAsia="Microsoft YaHei UI"/>
+                <w:color w:val="203B55"/>
+                <w:sz w:val="18"/>
+              </w:rPr>
+              <w:t xml:space="preserve"> 是否包含 </w:t>
+            </w:r>
+            <w:r>
+              <w:rPr>
+                <w:rFonts w:ascii="Consolas" w:hAnsi="Consolas" w:eastAsia="Microsoft YaHei UI"/>
+                <w:color w:val="1F4D78"/>
+                <w:sz w:val="17"/>
+              </w:rPr>
+              <w:t>ContextMenuStrip</w:t>
+            </w:r>
+            <w:r>
+              <w:rPr>
+                <w:rFonts w:ascii="Calibri" w:hAnsi="Calibri" w:eastAsia="Microsoft YaHei UI"/>
+                <w:color w:val="203B55"/>
+                <w:sz w:val="18"/>
+              </w:rPr>
+              <w:t xml:space="preserve"> / </w:t>
+            </w:r>
+            <w:r>
+              <w:rPr>
+                <w:rFonts w:ascii="Consolas" w:hAnsi="Consolas" w:eastAsia="Microsoft YaHei UI"/>
+                <w:color w:val="1F4D78"/>
+                <w:sz w:val="17"/>
+              </w:rPr>
+              <w:t>ObjectDisposedException</w:t>
+            </w:r>
+          </w:p>
+        </w:tc>
+        <w:tc>
+          <w:tcPr>
+            <w:tcW w:type="dxa" w:w="4060"/>
+            <w:tcMar>
+              <w:top w:w="80" w:type="dxa"/>
+              <w:start w:w="120" w:type="dxa"/>
+              <w:bottom w:w="80" w:type="dxa"/>
+              <w:end w:w="120" w:type="dxa"/>
+            </w:tcMar>
+            <w:vAlign w:val="center"/>
+          </w:tcPr>
+          <w:p>
+            <w:pPr>
+              <w:spacing w:before="0" w:after="0" w:line="276" w:lineRule="auto"/>
+            </w:pPr>
+            <w:r>
+              <w:rPr>
+                <w:rFonts w:ascii="Calibri" w:hAnsi="Calibri" w:eastAsia="Microsoft YaHei UI"/>
+                <w:color w:val="203B55"/>
+                <w:sz w:val="18"/>
+              </w:rPr>
+              <w:t>升级至 v2.1.1；菜单改为延迟释放，同一次运行不会重复弹全局错误</w:t>
+            </w:r>
+          </w:p>
+        </w:tc>
+      </w:tr>
     </w:tbl>
     <w:p>
       <w:pPr>
@@ -7271,6 +8555,19 @@
           <w:sz w:val="22"/>
         </w:rPr>
         <w:t xml:space="preserve"> 和日志。</w:t>
+      </w:r>
+    </w:p>
+    <w:p>
+      <w:pPr>
+        <w:pStyle w:val="ListBullet"/>
+      </w:pPr>
+      <w:r>
+        <w:rPr>
+          <w:rFonts w:ascii="Calibri" w:hAnsi="Calibri" w:eastAsia="Microsoft YaHei UI"/>
+          <w:color w:val="203B55"/>
+          <w:sz w:val="22"/>
+        </w:rPr>
+        <w:t>设置与记忆使用原子替换和最后有效备份；长期记忆拒绝 API Key、密码和 token。</w:t>
       </w:r>
     </w:p>
     <w:p>
@@ -7877,7 +9174,7 @@
                 <w:color w:val="203B55"/>
                 <w:sz w:val="18"/>
               </w:rPr>
-              <w:t>P1</w:t>
+              <w:t>P2</w:t>
             </w:r>
           </w:p>
         </w:tc>
@@ -7902,7 +9199,7 @@
                 <w:color w:val="203B55"/>
                 <w:sz w:val="18"/>
               </w:rPr>
-              <w:t>GPT-SoVITS 进程日志未结构化采集</w:t>
+              <w:t>GPT-SoVITS 诊断仅保存在内存</w:t>
             </w:r>
           </w:p>
         </w:tc>
@@ -7927,7 +9224,7 @@
                 <w:color w:val="203B55"/>
                 <w:sz w:val="18"/>
               </w:rPr>
-              <w:t>仅在诊断模式写受限本地日志</w:t>
+              <w:t>可选诊断模式写入大小受限、自动轮换且不含聊天内容的日志</w:t>
             </w:r>
           </w:p>
         </w:tc>
@@ -8962,7 +10259,7 @@
           <w:color w:val="203B55"/>
           <w:sz w:val="21"/>
         </w:rPr>
-        <w:t>Iroha Agent v2.1.0 Windows 基线在构建、主要功能、视觉小说界面、首次语音部署、安全重新部署、真实语音生成和发布打包方面通过工程验收。DeepSeek 计费请求、目标设备长时稳定性与第三方素材授权由发布者完成最终确认。</w:t>
+        <w:t>Iroha Agent v2.1.1 Windows 基线在构建、主要功能、视觉小说界面、事务式语音部署、安全重新部署、记忆恢复、真实语音生成和发布打包方面通过工程验收。DeepSeek 计费请求、目标设备长时稳定性与第三方素材授权由发布者完成最终确认。</w:t>
       </w:r>
     </w:p>
     <w:sectPr>

</xml_diff>

<commit_message>
fix bottom action chrome at high DPI
</commit_message>
<xml_diff>
--- a/docs/彩叶_Iroha_Agent_工程验收与交接手册.docx
+++ b/docs/彩叶_Iroha_Agent_工程验收与交接手册.docx
@@ -9936,6 +9936,111 @@
                 <w:color w:val="203B55"/>
                 <w:sz w:val="18"/>
               </w:rPr>
+              <w:t>U-04</w:t>
+            </w:r>
+          </w:p>
+        </w:tc>
+        <w:tc>
+          <w:tcPr>
+            <w:tcW w:type="dxa" w:w="2500"/>
+            <w:tcMar>
+              <w:top w:w="80" w:type="dxa"/>
+              <w:start w:w="120" w:type="dxa"/>
+              <w:bottom w:w="80" w:type="dxa"/>
+              <w:end w:w="120" w:type="dxa"/>
+            </w:tcMar>
+            <w:vAlign w:val="center"/>
+          </w:tcPr>
+          <w:p>
+            <w:pPr>
+              <w:spacing w:before="0" w:after="0" w:line="276" w:lineRule="auto"/>
+            </w:pPr>
+            <w:r>
+              <w:rPr>
+                <w:rFonts w:ascii="Calibri" w:hAnsi="Calibri" w:eastAsia="Microsoft YaHei UI"/>
+                <w:color w:val="203B55"/>
+                <w:sz w:val="18"/>
+              </w:rPr>
+              <w:t>150% Windows 缩放下快捷按钮无方形底色，附件与发送按钮保持圆形、分离且不贴边</w:t>
+            </w:r>
+          </w:p>
+        </w:tc>
+        <w:tc>
+          <w:tcPr>
+            <w:tcW w:type="dxa" w:w="1400"/>
+            <w:tcMar>
+              <w:top w:w="80" w:type="dxa"/>
+              <w:start w:w="120" w:type="dxa"/>
+              <w:bottom w:w="80" w:type="dxa"/>
+              <w:end w:w="120" w:type="dxa"/>
+            </w:tcMar>
+            <w:vAlign w:val="center"/>
+          </w:tcPr>
+          <w:p>
+            <w:pPr>
+              <w:spacing w:before="0" w:after="0" w:line="276" w:lineRule="auto"/>
+            </w:pPr>
+            <w:r>
+              <w:rPr>
+                <w:rFonts w:ascii="Calibri" w:hAnsi="Calibri" w:eastAsia="Microsoft YaHei UI"/>
+                <w:color w:val="203B55"/>
+                <w:sz w:val="18"/>
+              </w:rPr>
+              <w:t>通过</w:t>
+            </w:r>
+          </w:p>
+        </w:tc>
+        <w:tc>
+          <w:tcPr>
+            <w:tcW w:type="dxa" w:w="4360"/>
+            <w:tcMar>
+              <w:top w:w="80" w:type="dxa"/>
+              <w:start w:w="120" w:type="dxa"/>
+              <w:bottom w:w="80" w:type="dxa"/>
+              <w:end w:w="120" w:type="dxa"/>
+            </w:tcMar>
+            <w:vAlign w:val="center"/>
+          </w:tcPr>
+          <w:p>
+            <w:pPr>
+              <w:spacing w:before="0" w:after="0" w:line="276" w:lineRule="auto"/>
+            </w:pPr>
+            <w:r>
+              <w:rPr>
+                <w:rFonts w:ascii="Calibri" w:hAnsi="Calibri" w:eastAsia="Microsoft YaHei UI"/>
+                <w:color w:val="203B55"/>
+                <w:sz w:val="18"/>
+              </w:rPr>
+              <w:t>2026-07-20 Bottom UI 338 项 QA、实机截图与前后对比</w:t>
+            </w:r>
+          </w:p>
+        </w:tc>
+      </w:tr>
+      <w:tr>
+        <w:trPr>
+          <w:cantSplit/>
+        </w:trPr>
+        <w:tc>
+          <w:tcPr>
+            <w:tcW w:type="dxa" w:w="1100"/>
+            <w:tcMar>
+              <w:top w:w="80" w:type="dxa"/>
+              <w:start w:w="120" w:type="dxa"/>
+              <w:bottom w:w="80" w:type="dxa"/>
+              <w:end w:w="120" w:type="dxa"/>
+            </w:tcMar>
+            <w:vAlign w:val="center"/>
+          </w:tcPr>
+          <w:p>
+            <w:pPr>
+              <w:spacing w:before="0" w:after="0" w:line="276" w:lineRule="auto"/>
+            </w:pPr>
+            <w:r>
+              <w:rPr>
+                <w:rFonts w:ascii="Calibri" w:hAnsi="Calibri" w:eastAsia="Microsoft YaHei UI"/>
+                <w:color w:val="203B55"/>
+                <w:sz w:val="18"/>
+              </w:rPr>
               <w:t>P-01</w:t>
             </w:r>
           </w:p>
@@ -10202,6 +10307,12 @@
         <w:t>docs/evidence/round-2026-07-19-v23-ui-stability-tools.png</w:t>
         <w:br/>
         <w:t>docs/evidence/round-2026-07-19-v23-ui-stability-qa.txt</w:t>
+        <w:br/>
+        <w:t>docs/evidence/round-2026-07-20-v23-bottom-ui-comparison.png</w:t>
+        <w:br/>
+        <w:t>docs/evidence/round-2026-07-20-v23-bottom-ui-final.png</w:t>
+        <w:br/>
+        <w:t>docs/evidence/round-2026-07-20-v23-bottom-ui-qa.txt</w:t>
       </w:r>
     </w:p>
     <w:p>
@@ -12294,6 +12405,35 @@
     </w:p>
     <w:p>
       <w:pPr>
+        <w:pStyle w:val="ListBullet"/>
+      </w:pPr>
+      <w:r>
+        <w:rPr>
+          <w:rFonts w:ascii="Calibri" w:hAnsi="Calibri" w:eastAsia="Microsoft YaHei UI"/>
+          <w:color w:val="203B55"/>
+          <w:sz w:val="22"/>
+        </w:rPr>
+        <w:t xml:space="preserve">透明自绘按钮必须使用与轮廓一致的 </w:t>
+      </w:r>
+      <w:r>
+        <w:rPr>
+          <w:rFonts w:ascii="Consolas" w:hAnsi="Consolas" w:eastAsia="Microsoft YaHei UI"/>
+          <w:color w:val="1F4D78"/>
+          <w:sz w:val="21"/>
+        </w:rPr>
+        <w:t>Region</w:t>
+      </w:r>
+      <w:r>
+        <w:rPr>
+          <w:rFonts w:ascii="Calibri" w:hAnsi="Calibri" w:eastAsia="Microsoft YaHei UI"/>
+          <w:color w:val="203B55"/>
+          <w:sz w:val="22"/>
+        </w:rPr>
+        <w:t>，并在 125%/150% 缩放的实际桌面合成画面中检查父控件重绘底色。</w:t>
+      </w:r>
+    </w:p>
+    <w:p>
+      <w:pPr>
         <w:pStyle w:val="Heading2"/>
       </w:pPr>
       <w:r>
@@ -13638,7 +13778,7 @@
           <w:color w:val="203B55"/>
           <w:sz w:val="22"/>
         </w:rPr>
-        <w:t>☐ Settings UI 261 项多尺寸、透明底色与像素边缘回归全部通过。</w:t>
+        <w:t>☐ Settings UI 338 项多尺寸、透明底色、圆角 Region 与像素边缘回归全部通过。</w:t>
       </w:r>
     </w:p>
     <w:p>

</xml_diff>

<commit_message>
fix composer attachment control and file drop
</commit_message>
<xml_diff>
--- a/docs/彩叶_Iroha_Agent_工程验收与交接手册.docx
+++ b/docs/彩叶_Iroha_Agent_工程验收与交接手册.docx
@@ -10041,6 +10041,111 @@
                 <w:color w:val="203B55"/>
                 <w:sz w:val="18"/>
               </w:rPr>
+              <w:t>U-05</w:t>
+            </w:r>
+          </w:p>
+        </w:tc>
+        <w:tc>
+          <w:tcPr>
+            <w:tcW w:type="dxa" w:w="2500"/>
+            <w:tcMar>
+              <w:top w:w="80" w:type="dxa"/>
+              <w:start w:w="120" w:type="dxa"/>
+              <w:bottom w:w="80" w:type="dxa"/>
+              <w:end w:w="120" w:type="dxa"/>
+            </w:tcMar>
+            <w:vAlign w:val="center"/>
+          </w:tcPr>
+          <w:p>
+            <w:pPr>
+              <w:spacing w:before="0" w:after="0" w:line="276" w:lineRule="auto"/>
+            </w:pPr>
+            <w:r>
+              <w:rPr>
+                <w:rFonts w:ascii="Calibri" w:hAnsi="Calibri" w:eastAsia="Microsoft YaHei UI"/>
+                <w:color w:val="203B55"/>
+                <w:sz w:val="18"/>
+              </w:rPr>
+              <w:t>附件圆钮只显示回形针，整个会话输入栏可接收受支持的单文件拖放，附件状态和错误反馈完整</w:t>
+            </w:r>
+          </w:p>
+        </w:tc>
+        <w:tc>
+          <w:tcPr>
+            <w:tcW w:type="dxa" w:w="1400"/>
+            <w:tcMar>
+              <w:top w:w="80" w:type="dxa"/>
+              <w:start w:w="120" w:type="dxa"/>
+              <w:bottom w:w="80" w:type="dxa"/>
+              <w:end w:w="120" w:type="dxa"/>
+            </w:tcMar>
+            <w:vAlign w:val="center"/>
+          </w:tcPr>
+          <w:p>
+            <w:pPr>
+              <w:spacing w:before="0" w:after="0" w:line="276" w:lineRule="auto"/>
+            </w:pPr>
+            <w:r>
+              <w:rPr>
+                <w:rFonts w:ascii="Calibri" w:hAnsi="Calibri" w:eastAsia="Microsoft YaHei UI"/>
+                <w:color w:val="203B55"/>
+                <w:sz w:val="18"/>
+              </w:rPr>
+              <w:t>通过</w:t>
+            </w:r>
+          </w:p>
+        </w:tc>
+        <w:tc>
+          <w:tcPr>
+            <w:tcW w:type="dxa" w:w="4360"/>
+            <w:tcMar>
+              <w:top w:w="80" w:type="dxa"/>
+              <w:start w:w="120" w:type="dxa"/>
+              <w:bottom w:w="80" w:type="dxa"/>
+              <w:end w:w="120" w:type="dxa"/>
+            </w:tcMar>
+            <w:vAlign w:val="center"/>
+          </w:tcPr>
+          <w:p>
+            <w:pPr>
+              <w:spacing w:before="0" w:after="0" w:line="276" w:lineRule="auto"/>
+            </w:pPr>
+            <w:r>
+              <w:rPr>
+                <w:rFonts w:ascii="Calibri" w:hAnsi="Calibri" w:eastAsia="Microsoft YaHei UI"/>
+                <w:color w:val="203B55"/>
+                <w:sz w:val="18"/>
+              </w:rPr>
+              <w:t>2026-07-20 Attachment Drop；684 项统一回归，其中 47 项功能 QA、382 项 UI QA，并完成最终截图复核</w:t>
+            </w:r>
+          </w:p>
+        </w:tc>
+      </w:tr>
+      <w:tr>
+        <w:trPr>
+          <w:cantSplit/>
+        </w:trPr>
+        <w:tc>
+          <w:tcPr>
+            <w:tcW w:type="dxa" w:w="1100"/>
+            <w:tcMar>
+              <w:top w:w="80" w:type="dxa"/>
+              <w:start w:w="120" w:type="dxa"/>
+              <w:bottom w:w="80" w:type="dxa"/>
+              <w:end w:w="120" w:type="dxa"/>
+            </w:tcMar>
+            <w:vAlign w:val="center"/>
+          </w:tcPr>
+          <w:p>
+            <w:pPr>
+              <w:spacing w:before="0" w:after="0" w:line="276" w:lineRule="auto"/>
+            </w:pPr>
+            <w:r>
+              <w:rPr>
+                <w:rFonts w:ascii="Calibri" w:hAnsi="Calibri" w:eastAsia="Microsoft YaHei UI"/>
+                <w:color w:val="203B55"/>
+                <w:sz w:val="18"/>
+              </w:rPr>
               <w:t>P-01</w:t>
             </w:r>
           </w:p>
@@ -10313,6 +10418,14 @@
         <w:t>docs/evidence/round-2026-07-20-v23-bottom-ui-final.png</w:t>
         <w:br/>
         <w:t>docs/evidence/round-2026-07-20-v23-bottom-ui-qa.txt</w:t>
+        <w:br/>
+        <w:t>docs/evidence/round-2026-07-20-v23-attachment-drop-main.png</w:t>
+        <w:br/>
+        <w:t>docs/evidence/round-2026-07-20-v23-attachment-drop-control.png</w:t>
+        <w:br/>
+        <w:t>docs/evidence/round-2026-07-20-v23-attachment-drop-functional-qa.txt</w:t>
+        <w:br/>
+        <w:t>docs/evidence/round-2026-07-20-v23-attachment-drop-settings-ui-qa.txt</w:t>
       </w:r>
     </w:p>
     <w:p>
@@ -13778,7 +13891,21 @@
           <w:color w:val="203B55"/>
           <w:sz w:val="22"/>
         </w:rPr>
-        <w:t>☐ Settings UI 338 项多尺寸、透明底色、圆角 Region 与像素边缘回归全部通过。</w:t>
+        <w:t>☐ Settings UI 382 项多尺寸、透明底色、圆角 Region、附件图标归属、拖放命中区与像素边缘回归全部通过。</w:t>
+      </w:r>
+    </w:p>
+    <w:p>
+      <w:pPr>
+        <w:spacing w:after="80"/>
+        <w:ind w:left="360" w:hanging="288"/>
+      </w:pPr>
+      <w:r>
+        <w:rPr>
+          <w:rFonts w:ascii="Calibri" w:hAnsi="Calibri" w:eastAsia="Microsoft YaHei UI"/>
+          <w:color w:val="203B55"/>
+          <w:sz w:val="22"/>
+        </w:rPr>
+        <w:t>☐ Functional QA 47 项主要交互回归全部通过，包括文件拖放、附件提示和非法格式拦截。</w:t>
       </w:r>
     </w:p>
     <w:p>

</xml_diff>

<commit_message>
fix composer icon ghosting in live rendering
</commit_message>
<xml_diff>
--- a/docs/彩叶_Iroha_Agent_工程验收与交接手册.docx
+++ b/docs/彩叶_Iroha_Agent_工程验收与交接手册.docx
@@ -10066,7 +10066,7 @@
                 <w:color w:val="203B55"/>
                 <w:sz w:val="18"/>
               </w:rPr>
-              <w:t>附件圆钮只显示回形针，整个会话输入栏可接收受支持的单文件拖放，附件状态和错误反馈完整</w:t>
+              <w:t>附件常态只显示无白边回形针，发送纸飞机独立绘制且不重影；整个会话输入栏可接收受支持的单文件拖放，附件状态和错误反馈完整</w:t>
             </w:r>
           </w:p>
         </w:tc>
@@ -10116,7 +10116,7 @@
                 <w:color w:val="203B55"/>
                 <w:sz w:val="18"/>
               </w:rPr>
-              <w:t>2026-07-20 Attachment Drop；684 项统一回归，其中 47 项功能 QA、382 项 UI QA，并完成最终截图复核</w:t>
+              <w:t>2026-07-20 Attachment Drop；684 项统一回归，其中 47 项功能 QA、382 项 UI QA，并完成 1920×1080 D 盘实机截图复核</w:t>
             </w:r>
           </w:p>
         </w:tc>

</xml_diff>

<commit_message>
fix response, voice, and Unicode reliability
</commit_message>
<xml_diff>
--- a/docs/彩叶_Iroha_Agent_工程验收与交接手册.docx
+++ b/docs/彩叶_Iroha_Agent_工程验收与交接手册.docx
@@ -909,6 +909,58 @@
           <w:sz w:val="22"/>
         </w:rPr>
         <w:t>中文文字回复、日语 GPT-SoVITS 语音播放。</w:t>
+      </w:r>
+    </w:p>
+    <w:p>
+      <w:pPr>
+        <w:pStyle w:val="ListBullet"/>
+      </w:pPr>
+      <w:r>
+        <w:rPr>
+          <w:rFonts w:ascii="Calibri" w:hAnsi="Calibri" w:eastAsia="Microsoft YaHei UI"/>
+          <w:color w:val="203B55"/>
+          <w:sz w:val="22"/>
+        </w:rPr>
+        <w:t>GPT-SoVITS OpenAPI 与真实短句推理双重健康检查、失败后一次自动恢复，以及脱离主程序输出管道的无日志后台运行。</w:t>
+      </w:r>
+    </w:p>
+    <w:p>
+      <w:pPr>
+        <w:pStyle w:val="ListBullet"/>
+      </w:pPr>
+      <w:r>
+        <w:rPr>
+          <w:rFonts w:ascii="Calibri" w:hAnsi="Calibri" w:eastAsia="Microsoft YaHei UI"/>
+          <w:color w:val="203B55"/>
+          <w:sz w:val="22"/>
+        </w:rPr>
+        <w:t>对话、历史、详情、记忆和逐字动画使用 Unicode 文本元素；组合 Emoji 不拆分，朗读前安全过滤图形并转换常用符号。</w:t>
+      </w:r>
+    </w:p>
+    <w:p>
+      <w:pPr>
+        <w:pStyle w:val="ListBullet"/>
+      </w:pPr>
+      <w:r>
+        <w:rPr>
+          <w:rFonts w:ascii="Calibri" w:hAnsi="Calibri" w:eastAsia="Microsoft YaHei UI"/>
+          <w:color w:val="203B55"/>
+          <w:sz w:val="22"/>
+        </w:rPr>
+        <w:t>VN 对白框完整回复入口、可滚动详情悬浮窗与模型/工具/语音分阶段加载反馈。</w:t>
+      </w:r>
+    </w:p>
+    <w:p>
+      <w:pPr>
+        <w:pStyle w:val="ListBullet"/>
+      </w:pPr>
+      <w:r>
+        <w:rPr>
+          <w:rFonts w:ascii="Calibri" w:hAnsi="Calibri" w:eastAsia="Microsoft YaHei UI"/>
+          <w:color w:val="203B55"/>
+          <w:sz w:val="22"/>
+        </w:rPr>
+        <w:t>中文显示稿与日语语音稿全文等价约束、结构完整性校验、一次修复和错误语音阻断。</w:t>
       </w:r>
     </w:p>
     <w:p>
@@ -4431,7 +4483,7 @@
                 <w:color w:val="203B55"/>
                 <w:sz w:val="18"/>
               </w:rPr>
-              <w:t>Python 引导脚本与 Numba 缓存</w:t>
+              <w:t>无日志 Python 引导脚本与 Numba 缓存</w:t>
             </w:r>
           </w:p>
         </w:tc>
@@ -5835,7 +5887,7 @@
           <w:color w:val="203B55"/>
           <w:sz w:val="22"/>
         </w:rPr>
-        <w:t xml:space="preserve"> 包含角色帧、表情与 UI 图。</w:t>
+        <w:t xml:space="preserve"> 只包含 20 项运行时白名单资源：高清背景、主立绘、4 张表情层、Q 版卡片与 13 张会话头像。</w:t>
       </w:r>
     </w:p>
     <w:p>
@@ -10146,7 +10198,7 @@
                 <w:color w:val="203B55"/>
                 <w:sz w:val="18"/>
               </w:rPr>
-              <w:t>P-01</w:t>
+              <w:t>U-06</w:t>
             </w:r>
           </w:p>
         </w:tc>
@@ -10171,7 +10223,7 @@
                 <w:color w:val="203B55"/>
                 <w:sz w:val="18"/>
               </w:rPr>
-              <w:t>Portable ZIP 与哈希</w:t>
+              <w:t>对白框详情入口在 8 组窗口尺寸下不压住正文；长回复滚动窗、分阶段加载动画和异常退出加载态完整</w:t>
             </w:r>
           </w:p>
         </w:tc>
@@ -10221,7 +10273,7 @@
                 <w:color w:val="203B55"/>
                 <w:sz w:val="18"/>
               </w:rPr>
-              <w:t>发布脚本 QA</w:t>
+              <w:t>2026-07-21 Response UX；60 项功能 QA、429 项 Settings UI QA 与 4 张截图</w:t>
             </w:r>
           </w:p>
         </w:tc>
@@ -10251,6 +10303,442 @@
                 <w:color w:val="203B55"/>
                 <w:sz w:val="18"/>
               </w:rPr>
+              <w:t>V-05</w:t>
+            </w:r>
+          </w:p>
+        </w:tc>
+        <w:tc>
+          <w:tcPr>
+            <w:tcW w:type="dxa" w:w="2500"/>
+            <w:tcMar>
+              <w:top w:w="80" w:type="dxa"/>
+              <w:start w:w="120" w:type="dxa"/>
+              <w:bottom w:w="80" w:type="dxa"/>
+              <w:end w:w="120" w:type="dxa"/>
+            </w:tcMar>
+            <w:vAlign w:val="center"/>
+          </w:tcPr>
+          <w:p>
+            <w:pPr>
+              <w:spacing w:before="0" w:after="0" w:line="276" w:lineRule="auto"/>
+            </w:pPr>
+            <w:r>
+              <w:rPr>
+                <w:rFonts w:ascii="Calibri" w:hAnsi="Calibri" w:eastAsia="Microsoft YaHei UI"/>
+                <w:color w:val="203B55"/>
+                <w:sz w:val="18"/>
+              </w:rPr>
+              <w:t>日语语音逐句覆盖中文全文，不完整文本补全一次后仍失败则阻止播放；完整多句 WAV 可生成、校验和播放</w:t>
+            </w:r>
+          </w:p>
+        </w:tc>
+        <w:tc>
+          <w:tcPr>
+            <w:tcW w:type="dxa" w:w="1400"/>
+            <w:tcMar>
+              <w:top w:w="80" w:type="dxa"/>
+              <w:start w:w="120" w:type="dxa"/>
+              <w:bottom w:w="80" w:type="dxa"/>
+              <w:end w:w="120" w:type="dxa"/>
+            </w:tcMar>
+            <w:vAlign w:val="center"/>
+          </w:tcPr>
+          <w:p>
+            <w:pPr>
+              <w:spacing w:before="0" w:after="0" w:line="276" w:lineRule="auto"/>
+            </w:pPr>
+            <w:r>
+              <w:rPr>
+                <w:rFonts w:ascii="Calibri" w:hAnsi="Calibri" w:eastAsia="Microsoft YaHei UI"/>
+                <w:color w:val="203B55"/>
+                <w:sz w:val="18"/>
+              </w:rPr>
+              <w:t>通过</w:t>
+            </w:r>
+          </w:p>
+        </w:tc>
+        <w:tc>
+          <w:tcPr>
+            <w:tcW w:type="dxa" w:w="4360"/>
+            <w:tcMar>
+              <w:top w:w="80" w:type="dxa"/>
+              <w:start w:w="120" w:type="dxa"/>
+              <w:bottom w:w="80" w:type="dxa"/>
+              <w:end w:w="120" w:type="dxa"/>
+            </w:tcMar>
+            <w:vAlign w:val="center"/>
+          </w:tcPr>
+          <w:p>
+            <w:pPr>
+              <w:spacing w:before="0" w:after="0" w:line="276" w:lineRule="auto"/>
+            </w:pPr>
+            <w:r>
+              <w:rPr>
+                <w:rFonts w:ascii="Calibri" w:hAnsi="Calibri" w:eastAsia="Microsoft YaHei UI"/>
+                <w:color w:val="203B55"/>
+                <w:sz w:val="18"/>
+              </w:rPr>
+              <w:t>2026-07-21 Full Reply Voice QA；25.48 秒 WAV、10 项真实回归</w:t>
+            </w:r>
+          </w:p>
+        </w:tc>
+      </w:tr>
+      <w:tr>
+        <w:trPr>
+          <w:cantSplit/>
+        </w:trPr>
+        <w:tc>
+          <w:tcPr>
+            <w:tcW w:type="dxa" w:w="1100"/>
+            <w:tcMar>
+              <w:top w:w="80" w:type="dxa"/>
+              <w:start w:w="120" w:type="dxa"/>
+              <w:bottom w:w="80" w:type="dxa"/>
+              <w:end w:w="120" w:type="dxa"/>
+            </w:tcMar>
+            <w:vAlign w:val="center"/>
+          </w:tcPr>
+          <w:p>
+            <w:pPr>
+              <w:spacing w:before="0" w:after="0" w:line="276" w:lineRule="auto"/>
+            </w:pPr>
+            <w:r>
+              <w:rPr>
+                <w:rFonts w:ascii="Calibri" w:hAnsi="Calibri" w:eastAsia="Microsoft YaHei UI"/>
+                <w:color w:val="203B55"/>
+                <w:sz w:val="18"/>
+              </w:rPr>
+              <w:t>U-07</w:t>
+            </w:r>
+          </w:p>
+        </w:tc>
+        <w:tc>
+          <w:tcPr>
+            <w:tcW w:type="dxa" w:w="2500"/>
+            <w:tcMar>
+              <w:top w:w="80" w:type="dxa"/>
+              <w:start w:w="120" w:type="dxa"/>
+              <w:bottom w:w="80" w:type="dxa"/>
+              <w:end w:w="120" w:type="dxa"/>
+            </w:tcMar>
+            <w:vAlign w:val="center"/>
+          </w:tcPr>
+          <w:p>
+            <w:pPr>
+              <w:spacing w:before="0" w:after="0" w:line="276" w:lineRule="auto"/>
+            </w:pPr>
+            <w:r>
+              <w:rPr>
+                <w:rFonts w:ascii="Calibri" w:hAnsi="Calibri" w:eastAsia="Microsoft YaHei UI"/>
+                <w:color w:val="203B55"/>
+                <w:sz w:val="18"/>
+              </w:rPr>
+              <w:t>Emoji、肤色、旗帜和 ZWJ 组合在对话、历史、详情与逐字动画中保持完整；无孤立 UTF-16 代理项</w:t>
+            </w:r>
+          </w:p>
+        </w:tc>
+        <w:tc>
+          <w:tcPr>
+            <w:tcW w:type="dxa" w:w="1400"/>
+            <w:tcMar>
+              <w:top w:w="80" w:type="dxa"/>
+              <w:start w:w="120" w:type="dxa"/>
+              <w:bottom w:w="80" w:type="dxa"/>
+              <w:end w:w="120" w:type="dxa"/>
+            </w:tcMar>
+            <w:vAlign w:val="center"/>
+          </w:tcPr>
+          <w:p>
+            <w:pPr>
+              <w:spacing w:before="0" w:after="0" w:line="276" w:lineRule="auto"/>
+            </w:pPr>
+            <w:r>
+              <w:rPr>
+                <w:rFonts w:ascii="Calibri" w:hAnsi="Calibri" w:eastAsia="Microsoft YaHei UI"/>
+                <w:color w:val="203B55"/>
+                <w:sz w:val="18"/>
+              </w:rPr>
+              <w:t>通过</w:t>
+            </w:r>
+          </w:p>
+        </w:tc>
+        <w:tc>
+          <w:tcPr>
+            <w:tcW w:type="dxa" w:w="4360"/>
+            <w:tcMar>
+              <w:top w:w="80" w:type="dxa"/>
+              <w:start w:w="120" w:type="dxa"/>
+              <w:bottom w:w="80" w:type="dxa"/>
+              <w:end w:w="120" w:type="dxa"/>
+            </w:tcMar>
+            <w:vAlign w:val="center"/>
+          </w:tcPr>
+          <w:p>
+            <w:pPr>
+              <w:spacing w:before="0" w:after="0" w:line="276" w:lineRule="auto"/>
+            </w:pPr>
+            <w:r>
+              <w:rPr>
+                <w:rFonts w:ascii="Calibri" w:hAnsi="Calibri" w:eastAsia="Microsoft YaHei UI"/>
+                <w:color w:val="203B55"/>
+                <w:sz w:val="18"/>
+              </w:rPr>
+              <w:t>2026-07-21 Voice Recovery &amp; Unicode；69 项功能 QA、764 项统一回归</w:t>
+            </w:r>
+          </w:p>
+        </w:tc>
+      </w:tr>
+      <w:tr>
+        <w:trPr>
+          <w:cantSplit/>
+        </w:trPr>
+        <w:tc>
+          <w:tcPr>
+            <w:tcW w:type="dxa" w:w="1100"/>
+            <w:tcMar>
+              <w:top w:w="80" w:type="dxa"/>
+              <w:start w:w="120" w:type="dxa"/>
+              <w:bottom w:w="80" w:type="dxa"/>
+              <w:end w:w="120" w:type="dxa"/>
+            </w:tcMar>
+            <w:vAlign w:val="center"/>
+          </w:tcPr>
+          <w:p>
+            <w:pPr>
+              <w:spacing w:before="0" w:after="0" w:line="276" w:lineRule="auto"/>
+            </w:pPr>
+            <w:r>
+              <w:rPr>
+                <w:rFonts w:ascii="Calibri" w:hAnsi="Calibri" w:eastAsia="Microsoft YaHei UI"/>
+                <w:color w:val="203B55"/>
+                <w:sz w:val="18"/>
+              </w:rPr>
+              <w:t>V-06</w:t>
+            </w:r>
+          </w:p>
+        </w:tc>
+        <w:tc>
+          <w:tcPr>
+            <w:tcW w:type="dxa" w:w="2500"/>
+            <w:tcMar>
+              <w:top w:w="80" w:type="dxa"/>
+              <w:start w:w="120" w:type="dxa"/>
+              <w:bottom w:w="80" w:type="dxa"/>
+              <w:end w:w="120" w:type="dxa"/>
+            </w:tcMar>
+            <w:vAlign w:val="center"/>
+          </w:tcPr>
+          <w:p>
+            <w:pPr>
+              <w:spacing w:before="0" w:after="0" w:line="276" w:lineRule="auto"/>
+            </w:pPr>
+            <w:r>
+              <w:rPr>
+                <w:rFonts w:ascii="Calibri" w:hAnsi="Calibri" w:eastAsia="Microsoft YaHei UI"/>
+                <w:color w:val="203B55"/>
+                <w:sz w:val="18"/>
+              </w:rPr>
+              <w:t>GPT-SoVITS 使用真实推理验活；假在线时自动恢复，主程序退出后服务仍可生成，且不持久化语音文本日志</w:t>
+            </w:r>
+          </w:p>
+        </w:tc>
+        <w:tc>
+          <w:tcPr>
+            <w:tcW w:type="dxa" w:w="1400"/>
+            <w:tcMar>
+              <w:top w:w="80" w:type="dxa"/>
+              <w:start w:w="120" w:type="dxa"/>
+              <w:bottom w:w="80" w:type="dxa"/>
+              <w:end w:w="120" w:type="dxa"/>
+            </w:tcMar>
+            <w:vAlign w:val="center"/>
+          </w:tcPr>
+          <w:p>
+            <w:pPr>
+              <w:spacing w:before="0" w:after="0" w:line="276" w:lineRule="auto"/>
+            </w:pPr>
+            <w:r>
+              <w:rPr>
+                <w:rFonts w:ascii="Calibri" w:hAnsi="Calibri" w:eastAsia="Microsoft YaHei UI"/>
+                <w:color w:val="203B55"/>
+                <w:sz w:val="18"/>
+              </w:rPr>
+              <w:t>通过</w:t>
+            </w:r>
+          </w:p>
+        </w:tc>
+        <w:tc>
+          <w:tcPr>
+            <w:tcW w:type="dxa" w:w="4360"/>
+            <w:tcMar>
+              <w:top w:w="80" w:type="dxa"/>
+              <w:start w:w="120" w:type="dxa"/>
+              <w:bottom w:w="80" w:type="dxa"/>
+              <w:end w:w="120" w:type="dxa"/>
+            </w:tcMar>
+            <w:vAlign w:val="center"/>
+          </w:tcPr>
+          <w:p>
+            <w:pPr>
+              <w:spacing w:before="0" w:after="0" w:line="276" w:lineRule="auto"/>
+            </w:pPr>
+            <w:r>
+              <w:rPr>
+                <w:rFonts w:ascii="Calibri" w:hAnsi="Calibri" w:eastAsia="Microsoft YaHei UI"/>
+                <w:color w:val="203B55"/>
+                <w:sz w:val="18"/>
+              </w:rPr>
+              <w:t xml:space="preserve">2026-07-21 Voice Recovery；10 项真实回归及退出后独立 </w:t>
+            </w:r>
+            <w:r>
+              <w:rPr>
+                <w:rFonts w:ascii="Consolas" w:hAnsi="Consolas" w:eastAsia="Microsoft YaHei UI"/>
+                <w:color w:val="1F4D78"/>
+                <w:sz w:val="17"/>
+              </w:rPr>
+              <w:t>/tts</w:t>
+            </w:r>
+            <w:r>
+              <w:rPr>
+                <w:rFonts w:ascii="Calibri" w:hAnsi="Calibri" w:eastAsia="Microsoft YaHei UI"/>
+                <w:color w:val="203B55"/>
+                <w:sz w:val="18"/>
+              </w:rPr>
+              <w:t xml:space="preserve"> 验证</w:t>
+            </w:r>
+          </w:p>
+        </w:tc>
+      </w:tr>
+      <w:tr>
+        <w:trPr>
+          <w:cantSplit/>
+        </w:trPr>
+        <w:tc>
+          <w:tcPr>
+            <w:tcW w:type="dxa" w:w="1100"/>
+            <w:tcMar>
+              <w:top w:w="80" w:type="dxa"/>
+              <w:start w:w="120" w:type="dxa"/>
+              <w:bottom w:w="80" w:type="dxa"/>
+              <w:end w:w="120" w:type="dxa"/>
+            </w:tcMar>
+            <w:vAlign w:val="center"/>
+          </w:tcPr>
+          <w:p>
+            <w:pPr>
+              <w:spacing w:before="0" w:after="0" w:line="276" w:lineRule="auto"/>
+            </w:pPr>
+            <w:r>
+              <w:rPr>
+                <w:rFonts w:ascii="Calibri" w:hAnsi="Calibri" w:eastAsia="Microsoft YaHei UI"/>
+                <w:color w:val="203B55"/>
+                <w:sz w:val="18"/>
+              </w:rPr>
+              <w:t>P-01</w:t>
+            </w:r>
+          </w:p>
+        </w:tc>
+        <w:tc>
+          <w:tcPr>
+            <w:tcW w:type="dxa" w:w="2500"/>
+            <w:tcMar>
+              <w:top w:w="80" w:type="dxa"/>
+              <w:start w:w="120" w:type="dxa"/>
+              <w:bottom w:w="80" w:type="dxa"/>
+              <w:end w:w="120" w:type="dxa"/>
+            </w:tcMar>
+            <w:vAlign w:val="center"/>
+          </w:tcPr>
+          <w:p>
+            <w:pPr>
+              <w:spacing w:before="0" w:after="0" w:line="276" w:lineRule="auto"/>
+            </w:pPr>
+            <w:r>
+              <w:rPr>
+                <w:rFonts w:ascii="Calibri" w:hAnsi="Calibri" w:eastAsia="Microsoft YaHei UI"/>
+                <w:color w:val="203B55"/>
+                <w:sz w:val="18"/>
+              </w:rPr>
+              <w:t>Portable ZIP 与哈希</w:t>
+            </w:r>
+          </w:p>
+        </w:tc>
+        <w:tc>
+          <w:tcPr>
+            <w:tcW w:type="dxa" w:w="1400"/>
+            <w:tcMar>
+              <w:top w:w="80" w:type="dxa"/>
+              <w:start w:w="120" w:type="dxa"/>
+              <w:bottom w:w="80" w:type="dxa"/>
+              <w:end w:w="120" w:type="dxa"/>
+            </w:tcMar>
+            <w:vAlign w:val="center"/>
+          </w:tcPr>
+          <w:p>
+            <w:pPr>
+              <w:spacing w:before="0" w:after="0" w:line="276" w:lineRule="auto"/>
+            </w:pPr>
+            <w:r>
+              <w:rPr>
+                <w:rFonts w:ascii="Calibri" w:hAnsi="Calibri" w:eastAsia="Microsoft YaHei UI"/>
+                <w:color w:val="203B55"/>
+                <w:sz w:val="18"/>
+              </w:rPr>
+              <w:t>通过</w:t>
+            </w:r>
+          </w:p>
+        </w:tc>
+        <w:tc>
+          <w:tcPr>
+            <w:tcW w:type="dxa" w:w="4360"/>
+            <w:tcMar>
+              <w:top w:w="80" w:type="dxa"/>
+              <w:start w:w="120" w:type="dxa"/>
+              <w:bottom w:w="80" w:type="dxa"/>
+              <w:end w:w="120" w:type="dxa"/>
+            </w:tcMar>
+            <w:vAlign w:val="center"/>
+          </w:tcPr>
+          <w:p>
+            <w:pPr>
+              <w:spacing w:before="0" w:after="0" w:line="276" w:lineRule="auto"/>
+            </w:pPr>
+            <w:r>
+              <w:rPr>
+                <w:rFonts w:ascii="Calibri" w:hAnsi="Calibri" w:eastAsia="Microsoft YaHei UI"/>
+                <w:color w:val="203B55"/>
+                <w:sz w:val="18"/>
+              </w:rPr>
+              <w:t>发布脚本 QA</w:t>
+            </w:r>
+          </w:p>
+        </w:tc>
+      </w:tr>
+      <w:tr>
+        <w:trPr>
+          <w:cantSplit/>
+        </w:trPr>
+        <w:tc>
+          <w:tcPr>
+            <w:tcW w:type="dxa" w:w="1100"/>
+            <w:tcMar>
+              <w:top w:w="80" w:type="dxa"/>
+              <w:start w:w="120" w:type="dxa"/>
+              <w:bottom w:w="80" w:type="dxa"/>
+              <w:end w:w="120" w:type="dxa"/>
+            </w:tcMar>
+            <w:vAlign w:val="center"/>
+          </w:tcPr>
+          <w:p>
+            <w:pPr>
+              <w:spacing w:before="0" w:after="0" w:line="276" w:lineRule="auto"/>
+            </w:pPr>
+            <w:r>
+              <w:rPr>
+                <w:rFonts w:ascii="Calibri" w:hAnsi="Calibri" w:eastAsia="Microsoft YaHei UI"/>
+                <w:color w:val="203B55"/>
+                <w:sz w:val="18"/>
+              </w:rPr>
               <w:t>P-02</w:t>
             </w:r>
           </w:p>
@@ -10327,6 +10815,111 @@
                 <w:sz w:val="18"/>
               </w:rPr>
               <w:t>发布脚本 QA</w:t>
+            </w:r>
+          </w:p>
+        </w:tc>
+      </w:tr>
+      <w:tr>
+        <w:trPr>
+          <w:cantSplit/>
+        </w:trPr>
+        <w:tc>
+          <w:tcPr>
+            <w:tcW w:type="dxa" w:w="1100"/>
+            <w:tcMar>
+              <w:top w:w="80" w:type="dxa"/>
+              <w:start w:w="120" w:type="dxa"/>
+              <w:bottom w:w="80" w:type="dxa"/>
+              <w:end w:w="120" w:type="dxa"/>
+            </w:tcMar>
+            <w:vAlign w:val="center"/>
+          </w:tcPr>
+          <w:p>
+            <w:pPr>
+              <w:spacing w:before="0" w:after="0" w:line="276" w:lineRule="auto"/>
+            </w:pPr>
+            <w:r>
+              <w:rPr>
+                <w:rFonts w:ascii="Calibri" w:hAnsi="Calibri" w:eastAsia="Microsoft YaHei UI"/>
+                <w:color w:val="203B55"/>
+                <w:sz w:val="18"/>
+              </w:rPr>
+              <w:t>P-03</w:t>
+            </w:r>
+          </w:p>
+        </w:tc>
+        <w:tc>
+          <w:tcPr>
+            <w:tcW w:type="dxa" w:w="2500"/>
+            <w:tcMar>
+              <w:top w:w="80" w:type="dxa"/>
+              <w:start w:w="120" w:type="dxa"/>
+              <w:bottom w:w="80" w:type="dxa"/>
+              <w:end w:w="120" w:type="dxa"/>
+            </w:tcMar>
+            <w:vAlign w:val="center"/>
+          </w:tcPr>
+          <w:p>
+            <w:pPr>
+              <w:spacing w:before="0" w:after="0" w:line="276" w:lineRule="auto"/>
+            </w:pPr>
+            <w:r>
+              <w:rPr>
+                <w:rFonts w:ascii="Calibri" w:hAnsi="Calibri" w:eastAsia="Microsoft YaHei UI"/>
+                <w:color w:val="203B55"/>
+                <w:sz w:val="18"/>
+              </w:rPr>
+              <w:t>不重压缩高清素材的运行时资源白名单、启动与体积优化</w:t>
+            </w:r>
+          </w:p>
+        </w:tc>
+        <w:tc>
+          <w:tcPr>
+            <w:tcW w:type="dxa" w:w="1400"/>
+            <w:tcMar>
+              <w:top w:w="80" w:type="dxa"/>
+              <w:start w:w="120" w:type="dxa"/>
+              <w:bottom w:w="80" w:type="dxa"/>
+              <w:end w:w="120" w:type="dxa"/>
+            </w:tcMar>
+            <w:vAlign w:val="center"/>
+          </w:tcPr>
+          <w:p>
+            <w:pPr>
+              <w:spacing w:before="0" w:after="0" w:line="276" w:lineRule="auto"/>
+            </w:pPr>
+            <w:r>
+              <w:rPr>
+                <w:rFonts w:ascii="Calibri" w:hAnsi="Calibri" w:eastAsia="Microsoft YaHei UI"/>
+                <w:color w:val="203B55"/>
+                <w:sz w:val="18"/>
+              </w:rPr>
+              <w:t>通过</w:t>
+            </w:r>
+          </w:p>
+        </w:tc>
+        <w:tc>
+          <w:tcPr>
+            <w:tcW w:type="dxa" w:w="4360"/>
+            <w:tcMar>
+              <w:top w:w="80" w:type="dxa"/>
+              <w:start w:w="120" w:type="dxa"/>
+              <w:bottom w:w="80" w:type="dxa"/>
+              <w:end w:w="120" w:type="dxa"/>
+            </w:tcMar>
+            <w:vAlign w:val="center"/>
+          </w:tcPr>
+          <w:p>
+            <w:pPr>
+              <w:spacing w:before="0" w:after="0" w:line="276" w:lineRule="auto"/>
+            </w:pPr>
+            <w:r>
+              <w:rPr>
+                <w:rFonts w:ascii="Calibri" w:hAnsi="Calibri" w:eastAsia="Microsoft YaHei UI"/>
+                <w:color w:val="203B55"/>
+                <w:sz w:val="18"/>
+              </w:rPr>
+              <w:t>2026-07-21 Performance；ZIP 9,895,213 字节，启动中位数 311.4 ms，解压包独立启动通过</w:t>
             </w:r>
           </w:p>
         </w:tc>
@@ -10426,6 +11019,28 @@
         <w:t>docs/evidence/round-2026-07-20-v23-attachment-drop-functional-qa.txt</w:t>
         <w:br/>
         <w:t>docs/evidence/round-2026-07-20-v23-attachment-drop-settings-ui-qa.txt</w:t>
+        <w:br/>
+        <w:t>docs/evidence/round-2026-07-21-v23-response-main.png</w:t>
+        <w:br/>
+        <w:t>docs/evidence/round-2026-07-21-v23-response-loading.png</w:t>
+        <w:br/>
+        <w:t>docs/evidence/round-2026-07-21-v23-response-detail.png</w:t>
+        <w:br/>
+        <w:t>docs/evidence/round-2026-07-21-v23-response-minimum.png</w:t>
+        <w:br/>
+        <w:t>docs/evidence/round-2026-07-21-v23-response-functional-qa.txt</w:t>
+        <w:br/>
+        <w:t>docs/evidence/round-2026-07-21-v23-response-settings-ui-qa.txt</w:t>
+        <w:br/>
+        <w:t>docs/evidence/round-2026-07-21-v23-full-reply-voice-qa.txt</w:t>
+        <w:br/>
+        <w:t>docs/evidence/round-2026-07-21-v23-response-performance.txt</w:t>
+        <w:br/>
+        <w:t>docs/evidence/round-2026-07-21-v23-voice-recovery-unicode-functional.txt</w:t>
+        <w:br/>
+        <w:t>docs/evidence/round-2026-07-21-v23-voice-recovery-unicode-summary.txt</w:t>
+        <w:br/>
+        <w:t>docs/evidence/round-2026-07-21-v23-voice-recovery-live.txt</w:t>
       </w:r>
     </w:p>
     <w:p>
@@ -11085,7 +11700,7 @@
                 <w:color w:val="203B55"/>
                 <w:sz w:val="18"/>
               </w:rPr>
-              <w:t>点击重新部署；应用不会把无关本地服务误判为 GPT-SoVITS</w:t>
+              <w:t>应用先执行真实短句探针并自动恢复一次；仍失败再点击重新部署</w:t>
             </w:r>
           </w:p>
         </w:tc>
@@ -13502,6 +14117,86 @@
                 <w:color w:val="203B55"/>
                 <w:sz w:val="18"/>
               </w:rPr>
+              <w:t>日语全文校验以提示词、长度、分句和数字覆盖为主</w:t>
+            </w:r>
+          </w:p>
+        </w:tc>
+        <w:tc>
+          <w:tcPr>
+            <w:tcW w:type="dxa" w:w="5360"/>
+            <w:tcMar>
+              <w:top w:w="80" w:type="dxa"/>
+              <w:start w:w="120" w:type="dxa"/>
+              <w:bottom w:w="80" w:type="dxa"/>
+              <w:end w:w="120" w:type="dxa"/>
+            </w:tcMar>
+            <w:vAlign w:val="center"/>
+          </w:tcPr>
+          <w:p>
+            <w:pPr>
+              <w:spacing w:before="0" w:after="0" w:line="276" w:lineRule="auto"/>
+            </w:pPr>
+            <w:r>
+              <w:rPr>
+                <w:rFonts w:ascii="Calibri" w:hAnsi="Calibri" w:eastAsia="Microsoft YaHei UI"/>
+                <w:color w:val="203B55"/>
+                <w:sz w:val="18"/>
+              </w:rPr>
+              <w:t>后续可增加本地双语句对齐器；在此之前校验失败时继续坚持不播放，而不是放宽完整性要求</w:t>
+            </w:r>
+          </w:p>
+        </w:tc>
+      </w:tr>
+      <w:tr>
+        <w:trPr>
+          <w:cantSplit/>
+        </w:trPr>
+        <w:tc>
+          <w:tcPr>
+            <w:tcW w:type="dxa" w:w="1000"/>
+            <w:tcMar>
+              <w:top w:w="80" w:type="dxa"/>
+              <w:start w:w="120" w:type="dxa"/>
+              <w:bottom w:w="80" w:type="dxa"/>
+              <w:end w:w="120" w:type="dxa"/>
+            </w:tcMar>
+            <w:vAlign w:val="center"/>
+          </w:tcPr>
+          <w:p>
+            <w:pPr>
+              <w:spacing w:before="0" w:after="0" w:line="276" w:lineRule="auto"/>
+            </w:pPr>
+            <w:r>
+              <w:rPr>
+                <w:rFonts w:ascii="Calibri" w:hAnsi="Calibri" w:eastAsia="Microsoft YaHei UI"/>
+                <w:color w:val="203B55"/>
+                <w:sz w:val="18"/>
+              </w:rPr>
+              <w:t>P2</w:t>
+            </w:r>
+          </w:p>
+        </w:tc>
+        <w:tc>
+          <w:tcPr>
+            <w:tcW w:type="dxa" w:w="3000"/>
+            <w:tcMar>
+              <w:top w:w="80" w:type="dxa"/>
+              <w:start w:w="120" w:type="dxa"/>
+              <w:bottom w:w="80" w:type="dxa"/>
+              <w:end w:w="120" w:type="dxa"/>
+            </w:tcMar>
+            <w:vAlign w:val="center"/>
+          </w:tcPr>
+          <w:p>
+            <w:pPr>
+              <w:spacing w:before="0" w:after="0" w:line="276" w:lineRule="auto"/>
+            </w:pPr>
+            <w:r>
+              <w:rPr>
+                <w:rFonts w:ascii="Calibri" w:hAnsi="Calibri" w:eastAsia="Microsoft YaHei UI"/>
+                <w:color w:val="203B55"/>
+                <w:sz w:val="18"/>
+              </w:rPr>
               <w:t>CPU 默认启动较慢</w:t>
             </w:r>
           </w:p>
@@ -13891,7 +14586,7 @@
           <w:color w:val="203B55"/>
           <w:sz w:val="22"/>
         </w:rPr>
-        <w:t>☐ Settings UI 382 项多尺寸、透明底色、圆角 Region、附件图标归属、拖放命中区与像素边缘回归全部通过。</w:t>
+        <w:t>☐ Settings UI 429 项多尺寸、透明底色、圆角 Region、详情入口、加载状态、附件图标归属、拖放命中区与像素边缘回归全部通过。</w:t>
       </w:r>
     </w:p>
     <w:p>
@@ -13905,7 +14600,51 @@
           <w:color w:val="203B55"/>
           <w:sz w:val="22"/>
         </w:rPr>
-        <w:t>☐ Functional QA 47 项主要交互回归全部通过，包括文件拖放、附件提示和非法格式拦截。</w:t>
+        <w:t>☐ Functional QA 69 项主要交互回归全部通过，包括完整回复、语音完整性、Unicode/Emoji、文件拖放、附件提示和非法格式拦截。</w:t>
+      </w:r>
+    </w:p>
+    <w:p>
+      <w:pPr>
+        <w:spacing w:after="80"/>
+        <w:ind w:left="360" w:hanging="288"/>
+      </w:pPr>
+      <w:r>
+        <w:rPr>
+          <w:rFonts w:ascii="Calibri" w:hAnsi="Calibri" w:eastAsia="Microsoft YaHei UI"/>
+          <w:color w:val="203B55"/>
+          <w:sz w:val="22"/>
+        </w:rPr>
+        <w:t>☐ 真实完整语音 10 项回归通过，并确认多句 WAV 时长、非静音、响度、播放和清理。</w:t>
+      </w:r>
+    </w:p>
+    <w:p>
+      <w:pPr>
+        <w:spacing w:after="80"/>
+        <w:ind w:left="360" w:hanging="288"/>
+      </w:pPr>
+      <w:r>
+        <w:rPr>
+          <w:rFonts w:ascii="Calibri" w:hAnsi="Calibri" w:eastAsia="Microsoft YaHei UI"/>
+          <w:color w:val="203B55"/>
+          <w:sz w:val="22"/>
+        </w:rPr>
+        <w:t xml:space="preserve">☐ 统一回归 764 项全部通过，并确认主程序退出后 GPT-SoVITS 仍可独立完成真实 </w:t>
+      </w:r>
+      <w:r>
+        <w:rPr>
+          <w:rFonts w:ascii="Consolas" w:hAnsi="Consolas" w:eastAsia="Microsoft YaHei UI"/>
+          <w:color w:val="1F4D78"/>
+          <w:sz w:val="21"/>
+        </w:rPr>
+        <w:t>/tts</w:t>
+      </w:r>
+      <w:r>
+        <w:rPr>
+          <w:rFonts w:ascii="Calibri" w:hAnsi="Calibri" w:eastAsia="Microsoft YaHei UI"/>
+          <w:color w:val="203B55"/>
+          <w:sz w:val="22"/>
+        </w:rPr>
+        <w:t xml:space="preserve"> 请求且不生成对话日志。</w:t>
       </w:r>
     </w:p>
     <w:p>

</xml_diff>